<commit_message>
feat: multiple table support.
</commit_message>
<xml_diff>
--- a/my-result.docx
+++ b/my-result.docx
@@ -81,6 +81,1658 @@
           <w:b/>
           <w:bCs/>
         </w:rPr>
+      </w:r>
+    </w:p>
+    <w:p>
+      <w:pPr>
+        <w:pStyle w:val="Normal"/>
+        <w:bidi w:val="0"/>
+        <w:jc w:val="center"/>
+        <w:rPr/>
+      </w:pPr>
+      <w:r>
+        <w:rPr/>
+      </w:r>
+    </w:p>
+    <w:p>
+      <w:pPr>
+        <w:pStyle w:val="Normal"/>
+        <w:bidi w:val="0"/>
+        <w:jc w:val="center"/>
+        <w:rPr/>
+      </w:pPr>
+      <w:r>
+        <w:rPr/>
+        <w:t>table2</w:t>
+      </w:r>
+    </w:p>
+    <w:tbl>
+      <w:tblPr>
+        <w:tblW w:w="5000" w:type="pct"/>
+        <w:jc w:val="left"/>
+        <w:tblInd w:w="-5" w:type="dxa"/>
+        <w:tblLayout w:type="fixed"/>
+        <w:tblCellMar>
+          <w:top w:w="55" w:type="dxa"/>
+          <w:left w:w="55" w:type="dxa"/>
+          <w:bottom w:w="55" w:type="dxa"/>
+          <w:right w:w="55" w:type="dxa"/>
+        </w:tblCellMar>
+      </w:tblPr>
+      <w:tblGrid>
+        <w:gridCol w:w="4818"/>
+        <w:gridCol w:w="4819"/>
+      </w:tblGrid>
+      <w:tr>
+        <w:trPr>
+          <w:trHeight w:val="450" w:hRule="atLeast"/>
+        </w:trPr>
+        <w:tc>
+          <w:tcPr>
+            <w:tcW w:w="4818" w:type="dxa"/>
+            <w:tcBorders>
+              <w:top w:val="single" w:sz="4" w:space="0" w:color="000000"/>
+              <w:left w:val="single" w:sz="4" w:space="0" w:color="000000"/>
+              <w:bottom w:val="single" w:sz="4" w:space="0" w:color="000000"/>
+            </w:tcBorders>
+          </w:tcPr>
+          <w:p>
+            <w:pPr>
+              <w:pStyle w:val="Normal"/>
+              <w:widowControl w:val="false"/>
+              <w:bidi w:val="0"/>
+              <w:jc w:val="left"/>
+              <w:rPr>
+                <w:b/>
+                <w:b/>
+                <w:bCs/>
+              </w:rPr>
+            </w:pPr>
+            <w:r>
+              <w:rPr>
+                <w:b/>
+                <w:bCs/>
+              </w:rPr>
+              <w:t>1000.01</w:t>
+            </w:r>
+          </w:p>
+        </w:tc>
+        <w:tc>
+          <w:tcPr>
+            <w:tcW w:w="4819" w:type="dxa"/>
+            <w:tcBorders>
+              <w:top w:val="single" w:sz="4" w:space="0" w:color="000000"/>
+              <w:left w:val="single" w:sz="4" w:space="0" w:color="000000"/>
+              <w:bottom w:val="single" w:sz="4" w:space="0" w:color="000000"/>
+              <w:right w:val="single" w:sz="4" w:space="0" w:color="000000"/>
+            </w:tcBorders>
+          </w:tcPr>
+          <w:p>
+            <w:pPr>
+              <w:pStyle w:val="Normal"/>
+              <w:widowControl w:val="false"/>
+              <w:bidi w:val="0"/>
+              <w:jc w:val="center"/>
+              <w:rPr/>
+            </w:pPr>
+            <w:r>
+              <w:rPr/>
+              <w:t>asdasd</w:t>
+            </w:r>
+          </w:p>
+        </w:tc>
+      </w:tr>
+      <w:tr>
+        <w:trPr>
+          <w:trHeight w:val="450" w:hRule="atLeast"/>
+        </w:trPr>
+        <w:tc>
+          <w:tcPr>
+            <w:tcW w:w="4818" w:type="dxa"/>
+            <w:tcBorders>
+              <w:top w:val="single" w:sz="4" w:space="0" w:color="000000"/>
+              <w:left w:val="single" w:sz="4" w:space="0" w:color="000000"/>
+              <w:bottom w:val="single" w:sz="4" w:space="0" w:color="000000"/>
+            </w:tcBorders>
+          </w:tcPr>
+          <w:p>
+            <w:pPr>
+              <w:pStyle w:val="Normal"/>
+              <w:widowControl w:val="false"/>
+              <w:bidi w:val="0"/>
+              <w:jc w:val="left"/>
+              <w:rPr>
+                <w:b/>
+                <w:b/>
+                <w:bCs/>
+              </w:rPr>
+            </w:pPr>
+            <w:r>
+              <w:rPr>
+                <w:b/>
+                <w:bCs/>
+              </w:rPr>
+              <w:t>2000</w:t>
+            </w:r>
+          </w:p>
+        </w:tc>
+        <w:tc>
+          <w:tcPr>
+            <w:tcW w:w="4819" w:type="dxa"/>
+            <w:tcBorders>
+              <w:top w:val="single" w:sz="4" w:space="0" w:color="000000"/>
+              <w:left w:val="single" w:sz="4" w:space="0" w:color="000000"/>
+              <w:bottom w:val="single" w:sz="4" w:space="0" w:color="000000"/>
+              <w:right w:val="single" w:sz="4" w:space="0" w:color="000000"/>
+            </w:tcBorders>
+          </w:tcPr>
+          <w:p>
+            <w:pPr>
+              <w:pStyle w:val="Normal"/>
+              <w:widowControl w:val="false"/>
+              <w:bidi w:val="0"/>
+              <w:jc w:val="center"/>
+              <w:rPr/>
+            </w:pPr>
+            <w:r>
+              <w:rPr/>
+              <w:t>qwe</w:t>
+            </w:r>
+          </w:p>
+        </w:tc>
+      </w:tr>
+    </w:tbl>
+    <w:p>
+      <w:pPr>
+        <w:pStyle w:val="Normal"/>
+        <w:bidi w:val="0"/>
+        <w:jc w:val="center"/>
+        <w:rPr/>
+      </w:pPr>
+      <w:r>
+        <w:rPr/>
+      </w:r>
+    </w:p>
+    <w:p>
+      <w:pPr>
+        <w:pStyle w:val="Normal"/>
+        <w:bidi w:val="0"/>
+        <w:jc w:val="center"/>
+        <w:rPr/>
+      </w:pPr>
+      <w:r>
+        <w:rPr/>
+      </w:r>
+    </w:p>
+    <w:p>
+      <w:pPr>
+        <w:pStyle w:val="Normal"/>
+        <w:bidi w:val="0"/>
+        <w:jc w:val="center"/>
+        <w:rPr/>
+      </w:pPr>
+      <w:r>
+        <w:rPr/>
+        <w:t>table1</w:t>
+      </w:r>
+    </w:p>
+    <w:tbl>
+      <w:tblPr>
+        <w:tblW w:w="5000" w:type="pct"/>
+        <w:jc w:val="left"/>
+        <w:tblInd w:w="-5" w:type="dxa"/>
+        <w:tblLayout w:type="fixed"/>
+        <w:tblCellMar>
+          <w:top w:w="55" w:type="dxa"/>
+          <w:left w:w="55" w:type="dxa"/>
+          <w:bottom w:w="55" w:type="dxa"/>
+          <w:right w:w="55" w:type="dxa"/>
+        </w:tblCellMar>
+      </w:tblPr>
+      <w:tblGrid>
+        <w:gridCol w:w="4818"/>
+        <w:gridCol w:w="4819"/>
+      </w:tblGrid>
+      <w:tr>
+        <w:trPr>
+          <w:trHeight w:val="450" w:hRule="atLeast"/>
+        </w:trPr>
+        <w:tc>
+          <w:tcPr>
+            <w:tcW w:w="4818" w:type="dxa"/>
+            <w:tcBorders>
+              <w:top w:val="single" w:sz="4" w:space="0" w:color="000000"/>
+              <w:left w:val="single" w:sz="4" w:space="0" w:color="000000"/>
+              <w:bottom w:val="single" w:sz="4" w:space="0" w:color="000000"/>
+            </w:tcBorders>
+          </w:tcPr>
+          <w:p>
+            <w:pPr>
+              <w:pStyle w:val="Normal"/>
+              <w:widowControl w:val="false"/>
+              <w:bidi w:val="0"/>
+              <w:jc w:val="left"/>
+              <w:rPr>
+                <w:b/>
+                <w:b/>
+                <w:bCs/>
+              </w:rPr>
+            </w:pPr>
+            <w:r>
+              <w:rPr>
+                <w:b/>
+                <w:bCs/>
+              </w:rPr>
+              <w:t>1000.01</w:t>
+            </w:r>
+          </w:p>
+        </w:tc>
+        <w:tc>
+          <w:tcPr>
+            <w:tcW w:w="4819" w:type="dxa"/>
+            <w:tcBorders>
+              <w:top w:val="single" w:sz="4" w:space="0" w:color="000000"/>
+              <w:left w:val="single" w:sz="4" w:space="0" w:color="000000"/>
+              <w:bottom w:val="single" w:sz="4" w:space="0" w:color="000000"/>
+              <w:right w:val="single" w:sz="4" w:space="0" w:color="000000"/>
+            </w:tcBorders>
+          </w:tcPr>
+          <w:p>
+            <w:pPr>
+              <w:pStyle w:val="Normal"/>
+              <w:widowControl w:val="false"/>
+              <w:bidi w:val="0"/>
+              <w:jc w:val="center"/>
+              <w:rPr/>
+            </w:pPr>
+            <w:r>
+              <w:rPr/>
+              <w:t>asdasd</w:t>
+            </w:r>
+          </w:p>
+        </w:tc>
+      </w:tr>
+      <w:tr>
+        <w:trPr>
+          <w:trHeight w:val="450" w:hRule="atLeast"/>
+        </w:trPr>
+        <w:tc>
+          <w:tcPr>
+            <w:tcW w:w="4818" w:type="dxa"/>
+            <w:tcBorders>
+              <w:top w:val="single" w:sz="4" w:space="0" w:color="000000"/>
+              <w:left w:val="single" w:sz="4" w:space="0" w:color="000000"/>
+              <w:bottom w:val="single" w:sz="4" w:space="0" w:color="000000"/>
+            </w:tcBorders>
+          </w:tcPr>
+          <w:p>
+            <w:pPr>
+              <w:pStyle w:val="Normal"/>
+              <w:widowControl w:val="false"/>
+              <w:bidi w:val="0"/>
+              <w:jc w:val="left"/>
+              <w:rPr>
+                <w:b/>
+                <w:b/>
+                <w:bCs/>
+              </w:rPr>
+            </w:pPr>
+            <w:r>
+              <w:rPr>
+                <w:b/>
+                <w:bCs/>
+              </w:rPr>
+              <w:t>2000</w:t>
+            </w:r>
+          </w:p>
+        </w:tc>
+        <w:tc>
+          <w:tcPr>
+            <w:tcW w:w="4819" w:type="dxa"/>
+            <w:tcBorders>
+              <w:top w:val="single" w:sz="4" w:space="0" w:color="000000"/>
+              <w:left w:val="single" w:sz="4" w:space="0" w:color="000000"/>
+              <w:bottom w:val="single" w:sz="4" w:space="0" w:color="000000"/>
+              <w:right w:val="single" w:sz="4" w:space="0" w:color="000000"/>
+            </w:tcBorders>
+          </w:tcPr>
+          <w:p>
+            <w:pPr>
+              <w:pStyle w:val="Normal"/>
+              <w:widowControl w:val="false"/>
+              <w:bidi w:val="0"/>
+              <w:jc w:val="center"/>
+              <w:rPr/>
+            </w:pPr>
+            <w:r>
+              <w:rPr/>
+              <w:t>qwe</w:t>
+            </w:r>
+          </w:p>
+        </w:tc>
+      </w:tr>
+    </w:tbl>
+    <w:p>
+      <w:pPr>
+        <w:pStyle w:val="Normal"/>
+        <w:bidi w:val="0"/>
+        <w:jc w:val="center"/>
+        <w:rPr/>
+      </w:pPr>
+      <w:r>
+        <w:rPr/>
+      </w:r>
+    </w:p>
+    <w:p>
+      <w:pPr>
+        <w:pStyle w:val="Normal"/>
+        <w:bidi w:val="0"/>
+        <w:jc w:val="center"/>
+        <w:rPr/>
+      </w:pPr>
+      <w:r>
+        <w:rPr/>
+      </w:r>
+    </w:p>
+    <w:p>
+      <w:pPr>
+        <w:pStyle w:val="Normal"/>
+        <w:bidi w:val="0"/>
+        <w:jc w:val="center"/>
+        <w:rPr/>
+      </w:pPr>
+      <w:r>
+        <w:rPr/>
+        <w:t>table1</w:t>
+      </w:r>
+    </w:p>
+    <w:tbl>
+      <w:tblPr>
+        <w:tblW w:w="5000" w:type="pct"/>
+        <w:jc w:val="left"/>
+        <w:tblInd w:w="-5" w:type="dxa"/>
+        <w:tblLayout w:type="fixed"/>
+        <w:tblCellMar>
+          <w:top w:w="55" w:type="dxa"/>
+          <w:left w:w="55" w:type="dxa"/>
+          <w:bottom w:w="55" w:type="dxa"/>
+          <w:right w:w="55" w:type="dxa"/>
+        </w:tblCellMar>
+      </w:tblPr>
+      <w:tblGrid>
+        <w:gridCol w:w="4818"/>
+        <w:gridCol w:w="4819"/>
+      </w:tblGrid>
+      <w:tr>
+        <w:trPr>
+          <w:trHeight w:val="450" w:hRule="atLeast"/>
+        </w:trPr>
+        <w:tc>
+          <w:tcPr>
+            <w:tcW w:w="4818" w:type="dxa"/>
+            <w:tcBorders>
+              <w:top w:val="single" w:sz="4" w:space="0" w:color="000000"/>
+              <w:left w:val="single" w:sz="4" w:space="0" w:color="000000"/>
+              <w:bottom w:val="single" w:sz="4" w:space="0" w:color="000000"/>
+            </w:tcBorders>
+          </w:tcPr>
+          <w:p>
+            <w:pPr>
+              <w:pStyle w:val="Normal"/>
+              <w:widowControl w:val="false"/>
+              <w:bidi w:val="0"/>
+              <w:jc w:val="left"/>
+              <w:rPr>
+                <w:b/>
+                <w:b/>
+                <w:bCs/>
+              </w:rPr>
+            </w:pPr>
+            <w:r>
+              <w:rPr>
+                <w:b/>
+                <w:bCs/>
+              </w:rPr>
+              <w:t>1000.01</w:t>
+            </w:r>
+          </w:p>
+        </w:tc>
+        <w:tc>
+          <w:tcPr>
+            <w:tcW w:w="4819" w:type="dxa"/>
+            <w:tcBorders>
+              <w:top w:val="single" w:sz="4" w:space="0" w:color="000000"/>
+              <w:left w:val="single" w:sz="4" w:space="0" w:color="000000"/>
+              <w:bottom w:val="single" w:sz="4" w:space="0" w:color="000000"/>
+              <w:right w:val="single" w:sz="4" w:space="0" w:color="000000"/>
+            </w:tcBorders>
+          </w:tcPr>
+          <w:p>
+            <w:pPr>
+              <w:pStyle w:val="Normal"/>
+              <w:widowControl w:val="false"/>
+              <w:bidi w:val="0"/>
+              <w:jc w:val="center"/>
+              <w:rPr/>
+            </w:pPr>
+            <w:r>
+              <w:rPr/>
+              <w:t>asdasd</w:t>
+            </w:r>
+          </w:p>
+        </w:tc>
+      </w:tr>
+      <w:tr>
+        <w:trPr>
+          <w:trHeight w:val="450" w:hRule="atLeast"/>
+        </w:trPr>
+        <w:tc>
+          <w:tcPr>
+            <w:tcW w:w="4818" w:type="dxa"/>
+            <w:tcBorders>
+              <w:top w:val="single" w:sz="4" w:space="0" w:color="000000"/>
+              <w:left w:val="single" w:sz="4" w:space="0" w:color="000000"/>
+              <w:bottom w:val="single" w:sz="4" w:space="0" w:color="000000"/>
+            </w:tcBorders>
+          </w:tcPr>
+          <w:p>
+            <w:pPr>
+              <w:pStyle w:val="Normal"/>
+              <w:widowControl w:val="false"/>
+              <w:bidi w:val="0"/>
+              <w:jc w:val="left"/>
+              <w:rPr>
+                <w:b/>
+                <w:b/>
+                <w:bCs/>
+              </w:rPr>
+            </w:pPr>
+            <w:r>
+              <w:rPr>
+                <w:b/>
+                <w:bCs/>
+              </w:rPr>
+              <w:t>2000</w:t>
+            </w:r>
+          </w:p>
+        </w:tc>
+        <w:tc>
+          <w:tcPr>
+            <w:tcW w:w="4819" w:type="dxa"/>
+            <w:tcBorders>
+              <w:top w:val="single" w:sz="4" w:space="0" w:color="000000"/>
+              <w:left w:val="single" w:sz="4" w:space="0" w:color="000000"/>
+              <w:bottom w:val="single" w:sz="4" w:space="0" w:color="000000"/>
+              <w:right w:val="single" w:sz="4" w:space="0" w:color="000000"/>
+            </w:tcBorders>
+          </w:tcPr>
+          <w:p>
+            <w:pPr>
+              <w:pStyle w:val="Normal"/>
+              <w:widowControl w:val="false"/>
+              <w:bidi w:val="0"/>
+              <w:jc w:val="center"/>
+              <w:rPr/>
+            </w:pPr>
+            <w:r>
+              <w:rPr/>
+              <w:t>qwe</w:t>
+            </w:r>
+          </w:p>
+        </w:tc>
+      </w:tr>
+    </w:tbl>
+    <w:p>
+      <w:pPr>
+        <w:pStyle w:val="Normal"/>
+        <w:bidi w:val="0"/>
+        <w:jc w:val="center"/>
+        <w:rPr/>
+      </w:pPr>
+      <w:r>
+        <w:rPr/>
+      </w:r>
+      <w:r>
+        <w:br w:type="page"/>
+      </w:r>
+    </w:p>
+    <w:p>
+      <w:pPr>
+        <w:pStyle w:val="Normal"/>
+        <w:bidi w:val="0"/>
+        <w:jc w:val="center"/>
+        <w:rPr/>
+      </w:pPr>
+      <w:r>
+        <w:rPr/>
+        <w:t>table1</w:t>
+      </w:r>
+    </w:p>
+    <w:tbl>
+      <w:tblPr>
+        <w:tblW w:w="5000" w:type="pct"/>
+        <w:jc w:val="left"/>
+        <w:tblInd w:w="-5" w:type="dxa"/>
+        <w:tblLayout w:type="fixed"/>
+        <w:tblCellMar>
+          <w:top w:w="55" w:type="dxa"/>
+          <w:left w:w="55" w:type="dxa"/>
+          <w:bottom w:w="55" w:type="dxa"/>
+          <w:right w:w="55" w:type="dxa"/>
+        </w:tblCellMar>
+      </w:tblPr>
+      <w:tblGrid>
+        <w:gridCol w:w="4818"/>
+        <w:gridCol w:w="4819"/>
+      </w:tblGrid>
+      <w:tr>
+        <w:trPr>
+          <w:trHeight w:val="450" w:hRule="atLeast"/>
+        </w:trPr>
+        <w:tc>
+          <w:tcPr>
+            <w:tcW w:w="4818" w:type="dxa"/>
+            <w:tcBorders>
+              <w:top w:val="single" w:sz="4" w:space="0" w:color="000000"/>
+              <w:left w:val="single" w:sz="4" w:space="0" w:color="000000"/>
+              <w:bottom w:val="single" w:sz="4" w:space="0" w:color="000000"/>
+            </w:tcBorders>
+          </w:tcPr>
+          <w:p>
+            <w:pPr>
+              <w:pStyle w:val="Normal"/>
+              <w:widowControl w:val="false"/>
+              <w:bidi w:val="0"/>
+              <w:jc w:val="left"/>
+              <w:rPr>
+                <w:b/>
+                <w:b/>
+                <w:bCs/>
+              </w:rPr>
+            </w:pPr>
+            <w:r>
+              <w:rPr>
+                <w:b/>
+                <w:bCs/>
+              </w:rPr>
+              <w:t>1000.01</w:t>
+            </w:r>
+          </w:p>
+        </w:tc>
+        <w:tc>
+          <w:tcPr>
+            <w:tcW w:w="4819" w:type="dxa"/>
+            <w:tcBorders>
+              <w:top w:val="single" w:sz="4" w:space="0" w:color="000000"/>
+              <w:left w:val="single" w:sz="4" w:space="0" w:color="000000"/>
+              <w:bottom w:val="single" w:sz="4" w:space="0" w:color="000000"/>
+              <w:right w:val="single" w:sz="4" w:space="0" w:color="000000"/>
+            </w:tcBorders>
+          </w:tcPr>
+          <w:p>
+            <w:pPr>
+              <w:pStyle w:val="Normal"/>
+              <w:widowControl w:val="false"/>
+              <w:bidi w:val="0"/>
+              <w:jc w:val="center"/>
+              <w:rPr/>
+            </w:pPr>
+            <w:r>
+              <w:rPr/>
+              <w:t>asdasd</w:t>
+            </w:r>
+          </w:p>
+        </w:tc>
+      </w:tr>
+      <w:tr>
+        <w:trPr>
+          <w:trHeight w:val="450" w:hRule="atLeast"/>
+        </w:trPr>
+        <w:tc>
+          <w:tcPr>
+            <w:tcW w:w="4818" w:type="dxa"/>
+            <w:tcBorders>
+              <w:top w:val="single" w:sz="4" w:space="0" w:color="000000"/>
+              <w:left w:val="single" w:sz="4" w:space="0" w:color="000000"/>
+              <w:bottom w:val="single" w:sz="4" w:space="0" w:color="000000"/>
+            </w:tcBorders>
+          </w:tcPr>
+          <w:p>
+            <w:pPr>
+              <w:pStyle w:val="Normal"/>
+              <w:widowControl w:val="false"/>
+              <w:bidi w:val="0"/>
+              <w:jc w:val="left"/>
+              <w:rPr>
+                <w:b/>
+                <w:b/>
+                <w:bCs/>
+              </w:rPr>
+            </w:pPr>
+            <w:r>
+              <w:rPr>
+                <w:b/>
+                <w:bCs/>
+              </w:rPr>
+              <w:t>2000</w:t>
+            </w:r>
+          </w:p>
+        </w:tc>
+        <w:tc>
+          <w:tcPr>
+            <w:tcW w:w="4819" w:type="dxa"/>
+            <w:tcBorders>
+              <w:top w:val="single" w:sz="4" w:space="0" w:color="000000"/>
+              <w:left w:val="single" w:sz="4" w:space="0" w:color="000000"/>
+              <w:bottom w:val="single" w:sz="4" w:space="0" w:color="000000"/>
+              <w:right w:val="single" w:sz="4" w:space="0" w:color="000000"/>
+            </w:tcBorders>
+          </w:tcPr>
+          <w:p>
+            <w:pPr>
+              <w:pStyle w:val="Normal"/>
+              <w:widowControl w:val="false"/>
+              <w:bidi w:val="0"/>
+              <w:jc w:val="center"/>
+              <w:rPr/>
+            </w:pPr>
+            <w:r>
+              <w:rPr/>
+              <w:t>qwe</w:t>
+            </w:r>
+          </w:p>
+        </w:tc>
+      </w:tr>
+    </w:tbl>
+    <w:p>
+      <w:pPr>
+        <w:pStyle w:val="Normal"/>
+        <w:bidi w:val="0"/>
+        <w:jc w:val="center"/>
+        <w:rPr/>
+      </w:pPr>
+      <w:r>
+        <w:rPr/>
+      </w:r>
+      <w:r>
+        <w:br w:type="page"/>
+      </w:r>
+    </w:p>
+    <w:p>
+      <w:pPr>
+        <w:pStyle w:val="Normal"/>
+        <w:bidi w:val="0"/>
+        <w:jc w:val="center"/>
+        <w:rPr/>
+      </w:pPr>
+      <w:r>
+        <w:rPr/>
+        <w:t>table1</w:t>
+      </w:r>
+    </w:p>
+    <w:tbl>
+      <w:tblPr>
+        <w:tblW w:w="5000" w:type="pct"/>
+        <w:jc w:val="left"/>
+        <w:tblInd w:w="-5" w:type="dxa"/>
+        <w:tblLayout w:type="fixed"/>
+        <w:tblCellMar>
+          <w:top w:w="55" w:type="dxa"/>
+          <w:left w:w="55" w:type="dxa"/>
+          <w:bottom w:w="55" w:type="dxa"/>
+          <w:right w:w="55" w:type="dxa"/>
+        </w:tblCellMar>
+      </w:tblPr>
+      <w:tblGrid>
+        <w:gridCol w:w="4818"/>
+        <w:gridCol w:w="4819"/>
+      </w:tblGrid>
+      <w:tr>
+        <w:trPr>
+          <w:trHeight w:val="450" w:hRule="atLeast"/>
+        </w:trPr>
+        <w:tc>
+          <w:tcPr>
+            <w:tcW w:w="4818" w:type="dxa"/>
+            <w:tcBorders>
+              <w:top w:val="single" w:sz="4" w:space="0" w:color="000000"/>
+              <w:left w:val="single" w:sz="4" w:space="0" w:color="000000"/>
+              <w:bottom w:val="single" w:sz="4" w:space="0" w:color="000000"/>
+            </w:tcBorders>
+          </w:tcPr>
+          <w:p>
+            <w:pPr>
+              <w:pStyle w:val="Normal"/>
+              <w:widowControl w:val="false"/>
+              <w:bidi w:val="0"/>
+              <w:jc w:val="left"/>
+              <w:rPr>
+                <w:b/>
+                <w:b/>
+                <w:bCs/>
+              </w:rPr>
+            </w:pPr>
+            <w:r>
+              <w:rPr>
+                <w:b/>
+                <w:bCs/>
+              </w:rPr>
+              <w:t>1000.01</w:t>
+            </w:r>
+          </w:p>
+        </w:tc>
+        <w:tc>
+          <w:tcPr>
+            <w:tcW w:w="4819" w:type="dxa"/>
+            <w:tcBorders>
+              <w:top w:val="single" w:sz="4" w:space="0" w:color="000000"/>
+              <w:left w:val="single" w:sz="4" w:space="0" w:color="000000"/>
+              <w:bottom w:val="single" w:sz="4" w:space="0" w:color="000000"/>
+              <w:right w:val="single" w:sz="4" w:space="0" w:color="000000"/>
+            </w:tcBorders>
+          </w:tcPr>
+          <w:p>
+            <w:pPr>
+              <w:pStyle w:val="Normal"/>
+              <w:widowControl w:val="false"/>
+              <w:bidi w:val="0"/>
+              <w:jc w:val="center"/>
+              <w:rPr/>
+            </w:pPr>
+            <w:r>
+              <w:rPr/>
+              <w:t>asdasd</w:t>
+            </w:r>
+          </w:p>
+        </w:tc>
+      </w:tr>
+      <w:tr>
+        <w:trPr>
+          <w:trHeight w:val="450" w:hRule="atLeast"/>
+        </w:trPr>
+        <w:tc>
+          <w:tcPr>
+            <w:tcW w:w="4818" w:type="dxa"/>
+            <w:tcBorders>
+              <w:top w:val="single" w:sz="4" w:space="0" w:color="000000"/>
+              <w:left w:val="single" w:sz="4" w:space="0" w:color="000000"/>
+              <w:bottom w:val="single" w:sz="4" w:space="0" w:color="000000"/>
+            </w:tcBorders>
+          </w:tcPr>
+          <w:p>
+            <w:pPr>
+              <w:pStyle w:val="Normal"/>
+              <w:widowControl w:val="false"/>
+              <w:bidi w:val="0"/>
+              <w:jc w:val="left"/>
+              <w:rPr>
+                <w:b/>
+                <w:b/>
+                <w:bCs/>
+              </w:rPr>
+            </w:pPr>
+            <w:r>
+              <w:rPr>
+                <w:b/>
+                <w:bCs/>
+              </w:rPr>
+              <w:t>2000</w:t>
+            </w:r>
+          </w:p>
+        </w:tc>
+        <w:tc>
+          <w:tcPr>
+            <w:tcW w:w="4819" w:type="dxa"/>
+            <w:tcBorders>
+              <w:top w:val="single" w:sz="4" w:space="0" w:color="000000"/>
+              <w:left w:val="single" w:sz="4" w:space="0" w:color="000000"/>
+              <w:bottom w:val="single" w:sz="4" w:space="0" w:color="000000"/>
+              <w:right w:val="single" w:sz="4" w:space="0" w:color="000000"/>
+            </w:tcBorders>
+          </w:tcPr>
+          <w:p>
+            <w:pPr>
+              <w:pStyle w:val="Normal"/>
+              <w:widowControl w:val="false"/>
+              <w:bidi w:val="0"/>
+              <w:jc w:val="center"/>
+              <w:rPr/>
+            </w:pPr>
+            <w:r>
+              <w:rPr/>
+              <w:t>qwe</w:t>
+            </w:r>
+          </w:p>
+        </w:tc>
+      </w:tr>
+    </w:tbl>
+    <w:p>
+      <w:pPr>
+        <w:pStyle w:val="Normal"/>
+        <w:bidi w:val="0"/>
+        <w:jc w:val="center"/>
+        <w:rPr/>
+      </w:pPr>
+      <w:r>
+        <w:rPr/>
+      </w:r>
+      <w:r>
+        <w:br w:type="page"/>
+      </w:r>
+    </w:p>
+    <w:p>
+      <w:pPr>
+        <w:pStyle w:val="Normal"/>
+        <w:bidi w:val="0"/>
+        <w:jc w:val="center"/>
+        <w:rPr/>
+      </w:pPr>
+      <w:r>
+        <w:rPr/>
+        <w:t>table1</w:t>
+      </w:r>
+    </w:p>
+    <w:tbl>
+      <w:tblPr>
+        <w:tblW w:w="5000" w:type="pct"/>
+        <w:jc w:val="left"/>
+        <w:tblInd w:w="-5" w:type="dxa"/>
+        <w:tblLayout w:type="fixed"/>
+        <w:tblCellMar>
+          <w:top w:w="55" w:type="dxa"/>
+          <w:left w:w="55" w:type="dxa"/>
+          <w:bottom w:w="55" w:type="dxa"/>
+          <w:right w:w="55" w:type="dxa"/>
+        </w:tblCellMar>
+      </w:tblPr>
+      <w:tblGrid>
+        <w:gridCol w:w="4818"/>
+        <w:gridCol w:w="4819"/>
+      </w:tblGrid>
+      <w:tr>
+        <w:trPr>
+          <w:trHeight w:val="450" w:hRule="atLeast"/>
+        </w:trPr>
+        <w:tc>
+          <w:tcPr>
+            <w:tcW w:w="4818" w:type="dxa"/>
+            <w:tcBorders>
+              <w:top w:val="single" w:sz="4" w:space="0" w:color="000000"/>
+              <w:left w:val="single" w:sz="4" w:space="0" w:color="000000"/>
+              <w:bottom w:val="single" w:sz="4" w:space="0" w:color="000000"/>
+            </w:tcBorders>
+          </w:tcPr>
+          <w:p>
+            <w:pPr>
+              <w:pStyle w:val="Normal"/>
+              <w:widowControl w:val="false"/>
+              <w:bidi w:val="0"/>
+              <w:jc w:val="left"/>
+              <w:rPr>
+                <w:b/>
+                <w:b/>
+                <w:bCs/>
+              </w:rPr>
+            </w:pPr>
+            <w:r>
+              <w:rPr>
+                <w:b/>
+                <w:bCs/>
+              </w:rPr>
+              <w:t>1000.01</w:t>
+            </w:r>
+          </w:p>
+        </w:tc>
+        <w:tc>
+          <w:tcPr>
+            <w:tcW w:w="4819" w:type="dxa"/>
+            <w:tcBorders>
+              <w:top w:val="single" w:sz="4" w:space="0" w:color="000000"/>
+              <w:left w:val="single" w:sz="4" w:space="0" w:color="000000"/>
+              <w:bottom w:val="single" w:sz="4" w:space="0" w:color="000000"/>
+              <w:right w:val="single" w:sz="4" w:space="0" w:color="000000"/>
+            </w:tcBorders>
+          </w:tcPr>
+          <w:p>
+            <w:pPr>
+              <w:pStyle w:val="Normal"/>
+              <w:widowControl w:val="false"/>
+              <w:bidi w:val="0"/>
+              <w:jc w:val="center"/>
+              <w:rPr/>
+            </w:pPr>
+            <w:r>
+              <w:rPr/>
+              <w:t>asdasd</w:t>
+            </w:r>
+          </w:p>
+        </w:tc>
+      </w:tr>
+      <w:tr>
+        <w:trPr>
+          <w:trHeight w:val="450" w:hRule="atLeast"/>
+        </w:trPr>
+        <w:tc>
+          <w:tcPr>
+            <w:tcW w:w="4818" w:type="dxa"/>
+            <w:tcBorders>
+              <w:top w:val="single" w:sz="4" w:space="0" w:color="000000"/>
+              <w:left w:val="single" w:sz="4" w:space="0" w:color="000000"/>
+              <w:bottom w:val="single" w:sz="4" w:space="0" w:color="000000"/>
+            </w:tcBorders>
+          </w:tcPr>
+          <w:p>
+            <w:pPr>
+              <w:pStyle w:val="Normal"/>
+              <w:widowControl w:val="false"/>
+              <w:bidi w:val="0"/>
+              <w:jc w:val="left"/>
+              <w:rPr>
+                <w:b/>
+                <w:b/>
+                <w:bCs/>
+              </w:rPr>
+            </w:pPr>
+            <w:r>
+              <w:rPr>
+                <w:b/>
+                <w:bCs/>
+              </w:rPr>
+              <w:t>2000</w:t>
+            </w:r>
+          </w:p>
+        </w:tc>
+        <w:tc>
+          <w:tcPr>
+            <w:tcW w:w="4819" w:type="dxa"/>
+            <w:tcBorders>
+              <w:top w:val="single" w:sz="4" w:space="0" w:color="000000"/>
+              <w:left w:val="single" w:sz="4" w:space="0" w:color="000000"/>
+              <w:bottom w:val="single" w:sz="4" w:space="0" w:color="000000"/>
+              <w:right w:val="single" w:sz="4" w:space="0" w:color="000000"/>
+            </w:tcBorders>
+          </w:tcPr>
+          <w:p>
+            <w:pPr>
+              <w:pStyle w:val="Normal"/>
+              <w:widowControl w:val="false"/>
+              <w:bidi w:val="0"/>
+              <w:jc w:val="center"/>
+              <w:rPr/>
+            </w:pPr>
+            <w:r>
+              <w:rPr/>
+              <w:t>qwe</w:t>
+            </w:r>
+          </w:p>
+        </w:tc>
+      </w:tr>
+    </w:tbl>
+    <w:p>
+      <w:pPr>
+        <w:pStyle w:val="Normal"/>
+        <w:bidi w:val="0"/>
+        <w:jc w:val="center"/>
+        <w:rPr/>
+      </w:pPr>
+      <w:r>
+        <w:rPr/>
+      </w:r>
+      <w:r>
+        <w:br w:type="page"/>
+      </w:r>
+    </w:p>
+    <w:p>
+      <w:pPr>
+        <w:pStyle w:val="Normal"/>
+        <w:bidi w:val="0"/>
+        <w:jc w:val="center"/>
+        <w:rPr/>
+      </w:pPr>
+      <w:r>
+        <w:rPr/>
+        <w:t>table1</w:t>
+      </w:r>
+    </w:p>
+    <w:tbl>
+      <w:tblPr>
+        <w:tblW w:w="5000" w:type="pct"/>
+        <w:jc w:val="left"/>
+        <w:tblInd w:w="-5" w:type="dxa"/>
+        <w:tblLayout w:type="fixed"/>
+        <w:tblCellMar>
+          <w:top w:w="55" w:type="dxa"/>
+          <w:left w:w="55" w:type="dxa"/>
+          <w:bottom w:w="55" w:type="dxa"/>
+          <w:right w:w="55" w:type="dxa"/>
+        </w:tblCellMar>
+      </w:tblPr>
+      <w:tblGrid>
+        <w:gridCol w:w="4818"/>
+        <w:gridCol w:w="4819"/>
+      </w:tblGrid>
+      <w:tr>
+        <w:trPr>
+          <w:trHeight w:val="450" w:hRule="atLeast"/>
+        </w:trPr>
+        <w:tc>
+          <w:tcPr>
+            <w:tcW w:w="4818" w:type="dxa"/>
+            <w:tcBorders>
+              <w:top w:val="single" w:sz="4" w:space="0" w:color="000000"/>
+              <w:left w:val="single" w:sz="4" w:space="0" w:color="000000"/>
+              <w:bottom w:val="single" w:sz="4" w:space="0" w:color="000000"/>
+            </w:tcBorders>
+          </w:tcPr>
+          <w:p>
+            <w:pPr>
+              <w:pStyle w:val="Normal"/>
+              <w:widowControl w:val="false"/>
+              <w:bidi w:val="0"/>
+              <w:jc w:val="left"/>
+              <w:rPr>
+                <w:b/>
+                <w:b/>
+                <w:bCs/>
+              </w:rPr>
+            </w:pPr>
+            <w:r>
+              <w:rPr>
+                <w:b/>
+                <w:bCs/>
+              </w:rPr>
+              <w:t>1000.01</w:t>
+            </w:r>
+          </w:p>
+        </w:tc>
+        <w:tc>
+          <w:tcPr>
+            <w:tcW w:w="4819" w:type="dxa"/>
+            <w:tcBorders>
+              <w:top w:val="single" w:sz="4" w:space="0" w:color="000000"/>
+              <w:left w:val="single" w:sz="4" w:space="0" w:color="000000"/>
+              <w:bottom w:val="single" w:sz="4" w:space="0" w:color="000000"/>
+              <w:right w:val="single" w:sz="4" w:space="0" w:color="000000"/>
+            </w:tcBorders>
+          </w:tcPr>
+          <w:p>
+            <w:pPr>
+              <w:pStyle w:val="Normal"/>
+              <w:widowControl w:val="false"/>
+              <w:bidi w:val="0"/>
+              <w:jc w:val="center"/>
+              <w:rPr/>
+            </w:pPr>
+            <w:r>
+              <w:rPr/>
+              <w:t>asdasd</w:t>
+            </w:r>
+          </w:p>
+        </w:tc>
+      </w:tr>
+      <w:tr>
+        <w:trPr>
+          <w:trHeight w:val="450" w:hRule="atLeast"/>
+        </w:trPr>
+        <w:tc>
+          <w:tcPr>
+            <w:tcW w:w="4818" w:type="dxa"/>
+            <w:tcBorders>
+              <w:top w:val="single" w:sz="4" w:space="0" w:color="000000"/>
+              <w:left w:val="single" w:sz="4" w:space="0" w:color="000000"/>
+              <w:bottom w:val="single" w:sz="4" w:space="0" w:color="000000"/>
+            </w:tcBorders>
+          </w:tcPr>
+          <w:p>
+            <w:pPr>
+              <w:pStyle w:val="Normal"/>
+              <w:widowControl w:val="false"/>
+              <w:bidi w:val="0"/>
+              <w:jc w:val="left"/>
+              <w:rPr>
+                <w:b/>
+                <w:b/>
+                <w:bCs/>
+              </w:rPr>
+            </w:pPr>
+            <w:r>
+              <w:rPr>
+                <w:b/>
+                <w:bCs/>
+              </w:rPr>
+              <w:t>2000</w:t>
+            </w:r>
+          </w:p>
+        </w:tc>
+        <w:tc>
+          <w:tcPr>
+            <w:tcW w:w="4819" w:type="dxa"/>
+            <w:tcBorders>
+              <w:top w:val="single" w:sz="4" w:space="0" w:color="000000"/>
+              <w:left w:val="single" w:sz="4" w:space="0" w:color="000000"/>
+              <w:bottom w:val="single" w:sz="4" w:space="0" w:color="000000"/>
+              <w:right w:val="single" w:sz="4" w:space="0" w:color="000000"/>
+            </w:tcBorders>
+          </w:tcPr>
+          <w:p>
+            <w:pPr>
+              <w:pStyle w:val="Normal"/>
+              <w:widowControl w:val="false"/>
+              <w:bidi w:val="0"/>
+              <w:jc w:val="center"/>
+              <w:rPr/>
+            </w:pPr>
+            <w:r>
+              <w:rPr/>
+              <w:t>qwe</w:t>
+            </w:r>
+          </w:p>
+        </w:tc>
+      </w:tr>
+    </w:tbl>
+    <w:p>
+      <w:pPr>
+        <w:pStyle w:val="Normal"/>
+        <w:bidi w:val="0"/>
+        <w:jc w:val="center"/>
+        <w:rPr/>
+      </w:pPr>
+      <w:r>
+        <w:rPr/>
+      </w:r>
+      <w:r>
+        <w:br w:type="page"/>
+      </w:r>
+    </w:p>
+    <w:p>
+      <w:pPr>
+        <w:pStyle w:val="Normal"/>
+        <w:bidi w:val="0"/>
+        <w:jc w:val="center"/>
+        <w:rPr/>
+      </w:pPr>
+      <w:r>
+        <w:rPr/>
+        <w:t>table1</w:t>
+      </w:r>
+    </w:p>
+    <w:tbl>
+      <w:tblPr>
+        <w:tblW w:w="5000" w:type="pct"/>
+        <w:jc w:val="left"/>
+        <w:tblInd w:w="-5" w:type="dxa"/>
+        <w:tblLayout w:type="fixed"/>
+        <w:tblCellMar>
+          <w:top w:w="55" w:type="dxa"/>
+          <w:left w:w="55" w:type="dxa"/>
+          <w:bottom w:w="55" w:type="dxa"/>
+          <w:right w:w="55" w:type="dxa"/>
+        </w:tblCellMar>
+      </w:tblPr>
+      <w:tblGrid>
+        <w:gridCol w:w="4818"/>
+        <w:gridCol w:w="4819"/>
+      </w:tblGrid>
+      <w:tr>
+        <w:trPr>
+          <w:trHeight w:val="450" w:hRule="atLeast"/>
+        </w:trPr>
+        <w:tc>
+          <w:tcPr>
+            <w:tcW w:w="4818" w:type="dxa"/>
+            <w:tcBorders>
+              <w:top w:val="single" w:sz="4" w:space="0" w:color="000000"/>
+              <w:left w:val="single" w:sz="4" w:space="0" w:color="000000"/>
+              <w:bottom w:val="single" w:sz="4" w:space="0" w:color="000000"/>
+            </w:tcBorders>
+          </w:tcPr>
+          <w:p>
+            <w:pPr>
+              <w:pStyle w:val="Normal"/>
+              <w:widowControl w:val="false"/>
+              <w:bidi w:val="0"/>
+              <w:jc w:val="left"/>
+              <w:rPr>
+                <w:b/>
+                <w:b/>
+                <w:bCs/>
+              </w:rPr>
+            </w:pPr>
+            <w:r>
+              <w:rPr>
+                <w:b/>
+                <w:bCs/>
+              </w:rPr>
+              <w:t>1000.01</w:t>
+            </w:r>
+          </w:p>
+        </w:tc>
+        <w:tc>
+          <w:tcPr>
+            <w:tcW w:w="4819" w:type="dxa"/>
+            <w:tcBorders>
+              <w:top w:val="single" w:sz="4" w:space="0" w:color="000000"/>
+              <w:left w:val="single" w:sz="4" w:space="0" w:color="000000"/>
+              <w:bottom w:val="single" w:sz="4" w:space="0" w:color="000000"/>
+              <w:right w:val="single" w:sz="4" w:space="0" w:color="000000"/>
+            </w:tcBorders>
+          </w:tcPr>
+          <w:p>
+            <w:pPr>
+              <w:pStyle w:val="Normal"/>
+              <w:widowControl w:val="false"/>
+              <w:bidi w:val="0"/>
+              <w:jc w:val="center"/>
+              <w:rPr/>
+            </w:pPr>
+            <w:r>
+              <w:rPr/>
+              <w:t>asdasd</w:t>
+            </w:r>
+          </w:p>
+        </w:tc>
+      </w:tr>
+      <w:tr>
+        <w:trPr>
+          <w:trHeight w:val="450" w:hRule="atLeast"/>
+        </w:trPr>
+        <w:tc>
+          <w:tcPr>
+            <w:tcW w:w="4818" w:type="dxa"/>
+            <w:tcBorders>
+              <w:top w:val="single" w:sz="4" w:space="0" w:color="000000"/>
+              <w:left w:val="single" w:sz="4" w:space="0" w:color="000000"/>
+              <w:bottom w:val="single" w:sz="4" w:space="0" w:color="000000"/>
+            </w:tcBorders>
+          </w:tcPr>
+          <w:p>
+            <w:pPr>
+              <w:pStyle w:val="Normal"/>
+              <w:widowControl w:val="false"/>
+              <w:bidi w:val="0"/>
+              <w:jc w:val="left"/>
+              <w:rPr>
+                <w:b/>
+                <w:b/>
+                <w:bCs/>
+              </w:rPr>
+            </w:pPr>
+            <w:r>
+              <w:rPr>
+                <w:b/>
+                <w:bCs/>
+              </w:rPr>
+              <w:t>2000</w:t>
+            </w:r>
+          </w:p>
+        </w:tc>
+        <w:tc>
+          <w:tcPr>
+            <w:tcW w:w="4819" w:type="dxa"/>
+            <w:tcBorders>
+              <w:top w:val="single" w:sz="4" w:space="0" w:color="000000"/>
+              <w:left w:val="single" w:sz="4" w:space="0" w:color="000000"/>
+              <w:bottom w:val="single" w:sz="4" w:space="0" w:color="000000"/>
+              <w:right w:val="single" w:sz="4" w:space="0" w:color="000000"/>
+            </w:tcBorders>
+          </w:tcPr>
+          <w:p>
+            <w:pPr>
+              <w:pStyle w:val="Normal"/>
+              <w:widowControl w:val="false"/>
+              <w:bidi w:val="0"/>
+              <w:jc w:val="center"/>
+              <w:rPr/>
+            </w:pPr>
+            <w:r>
+              <w:rPr/>
+              <w:t>qwe</w:t>
+            </w:r>
+          </w:p>
+        </w:tc>
+      </w:tr>
+    </w:tbl>
+    <w:p>
+      <w:pPr>
+        <w:pStyle w:val="Normal"/>
+        <w:bidi w:val="0"/>
+        <w:jc w:val="center"/>
+        <w:rPr/>
+      </w:pPr>
+      <w:r>
+        <w:rPr/>
+      </w:r>
+      <w:r>
+        <w:br w:type="page"/>
+      </w:r>
+    </w:p>
+    <w:p>
+      <w:pPr>
+        <w:pStyle w:val="Normal"/>
+        <w:bidi w:val="0"/>
+        <w:jc w:val="center"/>
+        <w:rPr/>
+      </w:pPr>
+      <w:r>
+        <w:rPr/>
+        <w:t>table1</w:t>
+      </w:r>
+    </w:p>
+    <w:tbl>
+      <w:tblPr>
+        <w:tblW w:w="5000" w:type="pct"/>
+        <w:jc w:val="left"/>
+        <w:tblInd w:w="-5" w:type="dxa"/>
+        <w:tblLayout w:type="fixed"/>
+        <w:tblCellMar>
+          <w:top w:w="55" w:type="dxa"/>
+          <w:left w:w="55" w:type="dxa"/>
+          <w:bottom w:w="55" w:type="dxa"/>
+          <w:right w:w="55" w:type="dxa"/>
+        </w:tblCellMar>
+      </w:tblPr>
+      <w:tblGrid>
+        <w:gridCol w:w="4818"/>
+        <w:gridCol w:w="4819"/>
+      </w:tblGrid>
+      <w:tr>
+        <w:trPr>
+          <w:trHeight w:val="450" w:hRule="atLeast"/>
+        </w:trPr>
+        <w:tc>
+          <w:tcPr>
+            <w:tcW w:w="4818" w:type="dxa"/>
+            <w:tcBorders>
+              <w:top w:val="single" w:sz="4" w:space="0" w:color="000000"/>
+              <w:left w:val="single" w:sz="4" w:space="0" w:color="000000"/>
+              <w:bottom w:val="single" w:sz="4" w:space="0" w:color="000000"/>
+            </w:tcBorders>
+          </w:tcPr>
+          <w:p>
+            <w:pPr>
+              <w:pStyle w:val="Normal"/>
+              <w:widowControl w:val="false"/>
+              <w:bidi w:val="0"/>
+              <w:jc w:val="left"/>
+              <w:rPr>
+                <w:b/>
+                <w:b/>
+                <w:bCs/>
+              </w:rPr>
+            </w:pPr>
+            <w:r>
+              <w:rPr>
+                <w:b/>
+                <w:bCs/>
+              </w:rPr>
+              <w:t>1000.01</w:t>
+            </w:r>
+          </w:p>
+        </w:tc>
+        <w:tc>
+          <w:tcPr>
+            <w:tcW w:w="4819" w:type="dxa"/>
+            <w:tcBorders>
+              <w:top w:val="single" w:sz="4" w:space="0" w:color="000000"/>
+              <w:left w:val="single" w:sz="4" w:space="0" w:color="000000"/>
+              <w:bottom w:val="single" w:sz="4" w:space="0" w:color="000000"/>
+              <w:right w:val="single" w:sz="4" w:space="0" w:color="000000"/>
+            </w:tcBorders>
+          </w:tcPr>
+          <w:p>
+            <w:pPr>
+              <w:pStyle w:val="Normal"/>
+              <w:widowControl w:val="false"/>
+              <w:bidi w:val="0"/>
+              <w:jc w:val="center"/>
+              <w:rPr/>
+            </w:pPr>
+            <w:r>
+              <w:rPr/>
+              <w:t>asdasd</w:t>
+            </w:r>
+          </w:p>
+        </w:tc>
+      </w:tr>
+      <w:tr>
+        <w:trPr>
+          <w:trHeight w:val="450" w:hRule="atLeast"/>
+        </w:trPr>
+        <w:tc>
+          <w:tcPr>
+            <w:tcW w:w="4818" w:type="dxa"/>
+            <w:tcBorders>
+              <w:top w:val="single" w:sz="4" w:space="0" w:color="000000"/>
+              <w:left w:val="single" w:sz="4" w:space="0" w:color="000000"/>
+              <w:bottom w:val="single" w:sz="4" w:space="0" w:color="000000"/>
+            </w:tcBorders>
+          </w:tcPr>
+          <w:p>
+            <w:pPr>
+              <w:pStyle w:val="Normal"/>
+              <w:widowControl w:val="false"/>
+              <w:bidi w:val="0"/>
+              <w:jc w:val="left"/>
+              <w:rPr>
+                <w:b/>
+                <w:b/>
+                <w:bCs/>
+              </w:rPr>
+            </w:pPr>
+            <w:r>
+              <w:rPr>
+                <w:b/>
+                <w:bCs/>
+              </w:rPr>
+              <w:t>2000</w:t>
+            </w:r>
+          </w:p>
+        </w:tc>
+        <w:tc>
+          <w:tcPr>
+            <w:tcW w:w="4819" w:type="dxa"/>
+            <w:tcBorders>
+              <w:top w:val="single" w:sz="4" w:space="0" w:color="000000"/>
+              <w:left w:val="single" w:sz="4" w:space="0" w:color="000000"/>
+              <w:bottom w:val="single" w:sz="4" w:space="0" w:color="000000"/>
+              <w:right w:val="single" w:sz="4" w:space="0" w:color="000000"/>
+            </w:tcBorders>
+          </w:tcPr>
+          <w:p>
+            <w:pPr>
+              <w:pStyle w:val="Normal"/>
+              <w:widowControl w:val="false"/>
+              <w:bidi w:val="0"/>
+              <w:jc w:val="center"/>
+              <w:rPr/>
+            </w:pPr>
+            <w:r>
+              <w:rPr/>
+              <w:t>qwe</w:t>
+            </w:r>
+          </w:p>
+        </w:tc>
+      </w:tr>
+    </w:tbl>
+    <w:p>
+      <w:pPr>
+        <w:pStyle w:val="Normal"/>
+        <w:bidi w:val="0"/>
+        <w:jc w:val="center"/>
+        <w:rPr/>
+      </w:pPr>
+      <w:r>
+        <w:rPr/>
+      </w:r>
+    </w:p>
+    <w:p>
+      <w:pPr>
+        <w:pStyle w:val="Normal"/>
+        <w:bidi w:val="0"/>
+        <w:jc w:val="center"/>
+        <w:rPr/>
+      </w:pPr>
+      <w:r>
+        <w:rPr/>
+        <w:t>table1</w:t>
+      </w:r>
+    </w:p>
+    <w:tbl>
+      <w:tblPr>
+        <w:tblW w:w="5000" w:type="pct"/>
+        <w:jc w:val="left"/>
+        <w:tblInd w:w="-5" w:type="dxa"/>
+        <w:tblLayout w:type="fixed"/>
+        <w:tblCellMar>
+          <w:top w:w="55" w:type="dxa"/>
+          <w:left w:w="55" w:type="dxa"/>
+          <w:bottom w:w="55" w:type="dxa"/>
+          <w:right w:w="55" w:type="dxa"/>
+        </w:tblCellMar>
+      </w:tblPr>
+      <w:tblGrid>
+        <w:gridCol w:w="4818"/>
+        <w:gridCol w:w="4819"/>
+      </w:tblGrid>
+      <w:tr>
+        <w:trPr>
+          <w:trHeight w:val="450" w:hRule="atLeast"/>
+        </w:trPr>
+        <w:tc>
+          <w:tcPr>
+            <w:tcW w:w="4818" w:type="dxa"/>
+            <w:tcBorders>
+              <w:top w:val="single" w:sz="4" w:space="0" w:color="000000"/>
+              <w:left w:val="single" w:sz="4" w:space="0" w:color="000000"/>
+              <w:bottom w:val="single" w:sz="4" w:space="0" w:color="000000"/>
+            </w:tcBorders>
+          </w:tcPr>
+          <w:p>
+            <w:pPr>
+              <w:pStyle w:val="Normal"/>
+              <w:widowControl w:val="false"/>
+              <w:bidi w:val="0"/>
+              <w:jc w:val="left"/>
+              <w:rPr>
+                <w:b/>
+                <w:b/>
+                <w:bCs/>
+              </w:rPr>
+            </w:pPr>
+            <w:r>
+              <w:rPr>
+                <w:b/>
+                <w:bCs/>
+              </w:rPr>
+              <w:t>1000.01</w:t>
+            </w:r>
+          </w:p>
+        </w:tc>
+        <w:tc>
+          <w:tcPr>
+            <w:tcW w:w="4819" w:type="dxa"/>
+            <w:tcBorders>
+              <w:top w:val="single" w:sz="4" w:space="0" w:color="000000"/>
+              <w:left w:val="single" w:sz="4" w:space="0" w:color="000000"/>
+              <w:bottom w:val="single" w:sz="4" w:space="0" w:color="000000"/>
+              <w:right w:val="single" w:sz="4" w:space="0" w:color="000000"/>
+            </w:tcBorders>
+          </w:tcPr>
+          <w:p>
+            <w:pPr>
+              <w:pStyle w:val="Normal"/>
+              <w:widowControl w:val="false"/>
+              <w:bidi w:val="0"/>
+              <w:jc w:val="center"/>
+              <w:rPr/>
+            </w:pPr>
+            <w:r>
+              <w:rPr/>
+              <w:t>asdasd</w:t>
+            </w:r>
+          </w:p>
+        </w:tc>
+      </w:tr>
+      <w:tr>
+        <w:trPr>
+          <w:trHeight w:val="450" w:hRule="atLeast"/>
+        </w:trPr>
+        <w:tc>
+          <w:tcPr>
+            <w:tcW w:w="4818" w:type="dxa"/>
+            <w:tcBorders>
+              <w:top w:val="single" w:sz="4" w:space="0" w:color="000000"/>
+              <w:left w:val="single" w:sz="4" w:space="0" w:color="000000"/>
+              <w:bottom w:val="single" w:sz="4" w:space="0" w:color="000000"/>
+            </w:tcBorders>
+          </w:tcPr>
+          <w:p>
+            <w:pPr>
+              <w:pStyle w:val="Normal"/>
+              <w:widowControl w:val="false"/>
+              <w:bidi w:val="0"/>
+              <w:jc w:val="left"/>
+              <w:rPr>
+                <w:b/>
+                <w:b/>
+                <w:bCs/>
+              </w:rPr>
+            </w:pPr>
+            <w:r>
+              <w:rPr>
+                <w:b/>
+                <w:bCs/>
+              </w:rPr>
+              <w:t>2000</w:t>
+            </w:r>
+          </w:p>
+        </w:tc>
+        <w:tc>
+          <w:tcPr>
+            <w:tcW w:w="4819" w:type="dxa"/>
+            <w:tcBorders>
+              <w:top w:val="single" w:sz="4" w:space="0" w:color="000000"/>
+              <w:left w:val="single" w:sz="4" w:space="0" w:color="000000"/>
+              <w:bottom w:val="single" w:sz="4" w:space="0" w:color="000000"/>
+              <w:right w:val="single" w:sz="4" w:space="0" w:color="000000"/>
+            </w:tcBorders>
+          </w:tcPr>
+          <w:p>
+            <w:pPr>
+              <w:pStyle w:val="Normal"/>
+              <w:widowControl w:val="false"/>
+              <w:bidi w:val="0"/>
+              <w:jc w:val="center"/>
+              <w:rPr/>
+            </w:pPr>
+            <w:r>
+              <w:rPr/>
+              <w:t>qwe</w:t>
+            </w:r>
+          </w:p>
+        </w:tc>
+      </w:tr>
+    </w:tbl>
+    <w:p>
+      <w:pPr>
+        <w:pStyle w:val="Normal"/>
+        <w:bidi w:val="0"/>
+        <w:jc w:val="center"/>
+        <w:rPr/>
+      </w:pPr>
+      <w:r>
+        <w:rPr/>
+      </w:r>
+    </w:p>
+    <w:p>
+      <w:pPr>
+        <w:pStyle w:val="Normal"/>
+        <w:bidi w:val="0"/>
+        <w:jc w:val="center"/>
+        <w:rPr/>
+      </w:pPr>
+      <w:r>
+        <w:rPr/>
       </w:r>
     </w:p>
     <w:p>
@@ -207,7 +1859,7 @@
             </w:pPr>
             <w:r>
               <w:rPr/>
-              <w:t>100</w:t>
+              <w:t>100.00</w:t>
             </w:r>
           </w:p>
         </w:tc>
@@ -411,94 +2063,6 @@
         <w:rPr/>
       </w:r>
     </w:p>
-    <w:tbl>
-      <w:tblPr>
-        <w:tblW w:w="5000" w:type="pct"/>
-        <w:jc w:val="left"/>
-        <w:tblInd w:w="-5" w:type="dxa"/>
-        <w:tblLayout w:type="fixed"/>
-        <w:tblCellMar>
-          <w:top w:w="55" w:type="dxa"/>
-          <w:left w:w="55" w:type="dxa"/>
-          <w:bottom w:w="55" w:type="dxa"/>
-          <w:right w:w="55" w:type="dxa"/>
-        </w:tblCellMar>
-      </w:tblPr>
-      <w:tblGrid>
-        <w:gridCol w:w="4819"/>
-        <w:gridCol w:w="4819"/>
-      </w:tblGrid>
-      <w:tr>
-        <w:trPr>
-          <w:trHeight w:val="450" w:hRule="atLeast"/>
-        </w:trPr>
-        <w:tc>
-          <w:tcPr>
-            <w:tcW w:w="4819" w:type="dxa"/>
-            <w:tcBorders>
-              <w:top w:val="single" w:sz="4" w:space="0" w:color="000000"/>
-              <w:left w:val="single" w:sz="4" w:space="0" w:color="000000"/>
-              <w:bottom w:val="single" w:sz="4" w:space="0" w:color="000000"/>
-            </w:tcBorders>
-          </w:tcPr>
-          <w:p>
-            <w:pPr>
-              <w:pStyle w:val="Normal"/>
-              <w:widowControl w:val="false"/>
-              <w:bidi w:val="0"/>
-              <w:jc w:val="left"/>
-              <w:rPr>
-                <w:b/>
-                <w:b/>
-                <w:bCs/>
-              </w:rPr>
-            </w:pPr>
-            <w:r>
-              <w:rPr>
-                <w:b/>
-                <w:bCs/>
-              </w:rPr>
-              <w:t>{data.items[i].description}</w:t>
-            </w:r>
-          </w:p>
-        </w:tc>
-        <w:tc>
-          <w:tcPr>
-            <w:tcW w:w="4819" w:type="dxa"/>
-            <w:tcBorders>
-              <w:top w:val="single" w:sz="4" w:space="0" w:color="000000"/>
-              <w:left w:val="single" w:sz="4" w:space="0" w:color="000000"/>
-              <w:bottom w:val="single" w:sz="4" w:space="0" w:color="000000"/>
-              <w:right w:val="single" w:sz="4" w:space="0" w:color="000000"/>
-            </w:tcBorders>
-          </w:tcPr>
-          <w:p>
-            <w:pPr>
-              <w:pStyle w:val="Normal"/>
-              <w:widowControl w:val="false"/>
-              <w:bidi w:val="0"/>
-              <w:jc w:val="center"/>
-              <w:rPr/>
-            </w:pPr>
-            <w:r>
-              <w:rPr/>
-              <w:t>{data.items[i].price}</w:t>
-            </w:r>
-          </w:p>
-        </w:tc>
-      </w:tr>
-    </w:tbl>
-    <w:p>
-      <w:pPr>
-        <w:pStyle w:val="Normal"/>
-        <w:bidi w:val="0"/>
-        <w:jc w:val="center"/>
-        <w:rPr/>
-      </w:pPr>
-      <w:r>
-        <w:rPr/>
-      </w:r>
-    </w:p>
     <w:p>
       <w:pPr>
         <w:pStyle w:val="Normal"/>
@@ -554,7 +2118,7 @@
       </w:pPr>
       <w:r>
         <w:rPr/>
-        <w:t xml:space="preserve">Items: {description: Service 1, price: 100, quantity: 2}, {description: Service 2, price: 200, quantity: 2}, {description: Service 3, price: 300, quantity: 2}, {description: Service 4, price: 400, quantity: 2} </w:t>
+        <w:t xml:space="preserve">Items: {description: Service 1, price: 100.00, quantity: 2}, {description: Service 2, price: 200, quantity: 2}, {description: Service 3, price: 300, quantity: 2}, {description: Service 4, price: 400, quantity: 2} </w:t>
       </w:r>
     </w:p>
     <w:p>
@@ -647,7 +2211,7 @@
       </w:pPr>
       <w:r>
         <w:rPr/>
-        <w:t>First Item price: 100</w:t>
+        <w:t>First Item price: 100.00</w:t>
       </w:r>
     </w:p>
     <w:p>
@@ -739,7 +2303,7 @@
       </w:pPr>
       <w:r>
         <w:rPr/>
-        <w:t xml:space="preserve">Items (Objects): {description: Service 1, price: 100, quantity: 2}, {description: Service 2, price: 200, quantity: 2}, {description: Service 3, price: 300, quantity: 2}, {description: Service 4, price: 400, quantity: 2} </w:t>
+        <w:t xml:space="preserve">Items (Objects): {description: Service 1, price: 100.00, quantity: 2}, {description: Service 2, price: 200, quantity: 2}, {description: Service 3, price: 300, quantity: 2}, {description: Service 4, price: 400, quantity: 2} </w:t>
       </w:r>
     </w:p>
     <w:p>
@@ -775,7 +2339,7 @@
       </w:pPr>
       <w:r>
         <w:rPr/>
-        <w:t xml:space="preserve">Prices: 100, 200, 300, 400 </w:t>
+        <w:t xml:space="preserve">Prices: 100.00, 200, 300, 400 </w:t>
       </w:r>
     </w:p>
     <w:p>
@@ -849,7 +2413,7 @@
       </w:pPr>
       <w:r>
         <w:rPr/>
-        <w:t xml:space="preserve">Items (Objects): {description: Service 1, price: 100, quantity: 2}, {description: Service 2, price: 200, quantity: 2}, {description: Service 3, price: 300, quantity: 2}, {description: Service 4, price: 400, quantity: 2} </w:t>
+        <w:t xml:space="preserve">Items (Objects): {description: Service 1, price: 100.00, quantity: 2}, {description: Service 2, price: 200, quantity: 2}, {description: Service 3, price: 300, quantity: 2}, {description: Service 4, price: 400, quantity: 2} </w:t>
       </w:r>
     </w:p>
     <w:p>
@@ -885,7 +2449,7 @@
       </w:pPr>
       <w:r>
         <w:rPr/>
-        <w:t xml:space="preserve">Prices: 100, 200, 300, 400 </w:t>
+        <w:t xml:space="preserve">Prices: 100.00, 200, 300, 400 </w:t>
       </w:r>
     </w:p>
     <w:p>
@@ -920,7 +2484,11 @@
         <w:rPr/>
       </w:pPr>
       <w:r>
-        <w:rPr/>
+        <w:rPr>
+          <w:b/>
+          <w:bCs/>
+          <w:strike/>
+        </w:rPr>
         <w:t>Generic Pluck: {data.items|pluck('description')}</w:t>
       </w:r>
     </w:p>

</xml_diff>

<commit_message>
multiple table with formatters
</commit_message>
<xml_diff>
--- a/my-result.docx
+++ b/my-result.docx
@@ -70,6 +70,18 @@
         <w:pStyle w:val="Normal"/>
         <w:bidi w:val="0"/>
         <w:jc w:val="center"/>
+        <w:rPr/>
+      </w:pPr>
+      <w:r>
+        <w:rPr/>
+        <w:t>$400</w:t>
+      </w:r>
+    </w:p>
+    <w:p>
+      <w:pPr>
+        <w:pStyle w:val="Normal"/>
+        <w:bidi w:val="0"/>
+        <w:jc w:val="center"/>
         <w:rPr>
           <w:b/>
           <w:b/>
@@ -77,10 +89,7 @@
         </w:rPr>
       </w:pPr>
       <w:r>
-        <w:rPr>
-          <w:b/>
-          <w:bCs/>
-        </w:rPr>
+        <w:rPr/>
       </w:r>
     </w:p>
     <w:p>
@@ -176,8 +185,11 @@
               <w:rPr/>
             </w:pPr>
             <w:r>
-              <w:rPr/>
-              <w:t>asdasd</w:t>
+              <w:rPr>
+                <w:b/>
+                <w:bCs/>
+              </w:rPr>
+              <w:t>400</w:t>
             </w:r>
           </w:p>
         </w:tc>
@@ -235,8 +247,11 @@
               <w:rPr/>
             </w:pPr>
             <w:r>
-              <w:rPr/>
-              <w:t>qwe</w:t>
+              <w:rPr>
+                <w:b/>
+                <w:bCs/>
+              </w:rPr>
+              <w:t>{data.items|max(price)}</w:t>
             </w:r>
           </w:p>
         </w:tc>
@@ -605,6 +620,17 @@
       </w:pPr>
       <w:r>
         <w:rPr/>
+      </w:r>
+    </w:p>
+    <w:p>
+      <w:pPr>
+        <w:pStyle w:val="Normal"/>
+        <w:bidi w:val="0"/>
+        <w:jc w:val="center"/>
+        <w:rPr/>
+      </w:pPr>
+      <w:r>
+        <w:rPr/>
         <w:t>table1</w:t>
       </w:r>
     </w:p>
@@ -754,9 +780,6 @@
       <w:r>
         <w:rPr/>
       </w:r>
-      <w:r>
-        <w:br w:type="page"/>
-      </w:r>
     </w:p>
     <w:p>
       <w:pPr>
@@ -916,813 +939,6 @@
       <w:r>
         <w:rPr/>
       </w:r>
-      <w:r>
-        <w:br w:type="page"/>
-      </w:r>
-    </w:p>
-    <w:p>
-      <w:pPr>
-        <w:pStyle w:val="Normal"/>
-        <w:bidi w:val="0"/>
-        <w:jc w:val="center"/>
-        <w:rPr/>
-      </w:pPr>
-      <w:r>
-        <w:rPr/>
-        <w:t>table1</w:t>
-      </w:r>
-    </w:p>
-    <w:tbl>
-      <w:tblPr>
-        <w:tblW w:w="5000" w:type="pct"/>
-        <w:jc w:val="left"/>
-        <w:tblInd w:w="-5" w:type="dxa"/>
-        <w:tblLayout w:type="fixed"/>
-        <w:tblCellMar>
-          <w:top w:w="55" w:type="dxa"/>
-          <w:left w:w="55" w:type="dxa"/>
-          <w:bottom w:w="55" w:type="dxa"/>
-          <w:right w:w="55" w:type="dxa"/>
-        </w:tblCellMar>
-      </w:tblPr>
-      <w:tblGrid>
-        <w:gridCol w:w="4818"/>
-        <w:gridCol w:w="4819"/>
-      </w:tblGrid>
-      <w:tr>
-        <w:trPr>
-          <w:trHeight w:val="450" w:hRule="atLeast"/>
-        </w:trPr>
-        <w:tc>
-          <w:tcPr>
-            <w:tcW w:w="4818" w:type="dxa"/>
-            <w:tcBorders>
-              <w:top w:val="single" w:sz="4" w:space="0" w:color="000000"/>
-              <w:left w:val="single" w:sz="4" w:space="0" w:color="000000"/>
-              <w:bottom w:val="single" w:sz="4" w:space="0" w:color="000000"/>
-            </w:tcBorders>
-          </w:tcPr>
-          <w:p>
-            <w:pPr>
-              <w:pStyle w:val="Normal"/>
-              <w:widowControl w:val="false"/>
-              <w:bidi w:val="0"/>
-              <w:jc w:val="left"/>
-              <w:rPr>
-                <w:b/>
-                <w:b/>
-                <w:bCs/>
-              </w:rPr>
-            </w:pPr>
-            <w:r>
-              <w:rPr>
-                <w:b/>
-                <w:bCs/>
-              </w:rPr>
-              <w:t>1000.01</w:t>
-            </w:r>
-          </w:p>
-        </w:tc>
-        <w:tc>
-          <w:tcPr>
-            <w:tcW w:w="4819" w:type="dxa"/>
-            <w:tcBorders>
-              <w:top w:val="single" w:sz="4" w:space="0" w:color="000000"/>
-              <w:left w:val="single" w:sz="4" w:space="0" w:color="000000"/>
-              <w:bottom w:val="single" w:sz="4" w:space="0" w:color="000000"/>
-              <w:right w:val="single" w:sz="4" w:space="0" w:color="000000"/>
-            </w:tcBorders>
-          </w:tcPr>
-          <w:p>
-            <w:pPr>
-              <w:pStyle w:val="Normal"/>
-              <w:widowControl w:val="false"/>
-              <w:bidi w:val="0"/>
-              <w:jc w:val="center"/>
-              <w:rPr/>
-            </w:pPr>
-            <w:r>
-              <w:rPr/>
-              <w:t>asdasd</w:t>
-            </w:r>
-          </w:p>
-        </w:tc>
-      </w:tr>
-      <w:tr>
-        <w:trPr>
-          <w:trHeight w:val="450" w:hRule="atLeast"/>
-        </w:trPr>
-        <w:tc>
-          <w:tcPr>
-            <w:tcW w:w="4818" w:type="dxa"/>
-            <w:tcBorders>
-              <w:top w:val="single" w:sz="4" w:space="0" w:color="000000"/>
-              <w:left w:val="single" w:sz="4" w:space="0" w:color="000000"/>
-              <w:bottom w:val="single" w:sz="4" w:space="0" w:color="000000"/>
-            </w:tcBorders>
-          </w:tcPr>
-          <w:p>
-            <w:pPr>
-              <w:pStyle w:val="Normal"/>
-              <w:widowControl w:val="false"/>
-              <w:bidi w:val="0"/>
-              <w:jc w:val="left"/>
-              <w:rPr>
-                <w:b/>
-                <w:b/>
-                <w:bCs/>
-              </w:rPr>
-            </w:pPr>
-            <w:r>
-              <w:rPr>
-                <w:b/>
-                <w:bCs/>
-              </w:rPr>
-              <w:t>2000</w:t>
-            </w:r>
-          </w:p>
-        </w:tc>
-        <w:tc>
-          <w:tcPr>
-            <w:tcW w:w="4819" w:type="dxa"/>
-            <w:tcBorders>
-              <w:top w:val="single" w:sz="4" w:space="0" w:color="000000"/>
-              <w:left w:val="single" w:sz="4" w:space="0" w:color="000000"/>
-              <w:bottom w:val="single" w:sz="4" w:space="0" w:color="000000"/>
-              <w:right w:val="single" w:sz="4" w:space="0" w:color="000000"/>
-            </w:tcBorders>
-          </w:tcPr>
-          <w:p>
-            <w:pPr>
-              <w:pStyle w:val="Normal"/>
-              <w:widowControl w:val="false"/>
-              <w:bidi w:val="0"/>
-              <w:jc w:val="center"/>
-              <w:rPr/>
-            </w:pPr>
-            <w:r>
-              <w:rPr/>
-              <w:t>qwe</w:t>
-            </w:r>
-          </w:p>
-        </w:tc>
-      </w:tr>
-    </w:tbl>
-    <w:p>
-      <w:pPr>
-        <w:pStyle w:val="Normal"/>
-        <w:bidi w:val="0"/>
-        <w:jc w:val="center"/>
-        <w:rPr/>
-      </w:pPr>
-      <w:r>
-        <w:rPr/>
-      </w:r>
-      <w:r>
-        <w:br w:type="page"/>
-      </w:r>
-    </w:p>
-    <w:p>
-      <w:pPr>
-        <w:pStyle w:val="Normal"/>
-        <w:bidi w:val="0"/>
-        <w:jc w:val="center"/>
-        <w:rPr/>
-      </w:pPr>
-      <w:r>
-        <w:rPr/>
-        <w:t>table1</w:t>
-      </w:r>
-    </w:p>
-    <w:tbl>
-      <w:tblPr>
-        <w:tblW w:w="5000" w:type="pct"/>
-        <w:jc w:val="left"/>
-        <w:tblInd w:w="-5" w:type="dxa"/>
-        <w:tblLayout w:type="fixed"/>
-        <w:tblCellMar>
-          <w:top w:w="55" w:type="dxa"/>
-          <w:left w:w="55" w:type="dxa"/>
-          <w:bottom w:w="55" w:type="dxa"/>
-          <w:right w:w="55" w:type="dxa"/>
-        </w:tblCellMar>
-      </w:tblPr>
-      <w:tblGrid>
-        <w:gridCol w:w="4818"/>
-        <w:gridCol w:w="4819"/>
-      </w:tblGrid>
-      <w:tr>
-        <w:trPr>
-          <w:trHeight w:val="450" w:hRule="atLeast"/>
-        </w:trPr>
-        <w:tc>
-          <w:tcPr>
-            <w:tcW w:w="4818" w:type="dxa"/>
-            <w:tcBorders>
-              <w:top w:val="single" w:sz="4" w:space="0" w:color="000000"/>
-              <w:left w:val="single" w:sz="4" w:space="0" w:color="000000"/>
-              <w:bottom w:val="single" w:sz="4" w:space="0" w:color="000000"/>
-            </w:tcBorders>
-          </w:tcPr>
-          <w:p>
-            <w:pPr>
-              <w:pStyle w:val="Normal"/>
-              <w:widowControl w:val="false"/>
-              <w:bidi w:val="0"/>
-              <w:jc w:val="left"/>
-              <w:rPr>
-                <w:b/>
-                <w:b/>
-                <w:bCs/>
-              </w:rPr>
-            </w:pPr>
-            <w:r>
-              <w:rPr>
-                <w:b/>
-                <w:bCs/>
-              </w:rPr>
-              <w:t>1000.01</w:t>
-            </w:r>
-          </w:p>
-        </w:tc>
-        <w:tc>
-          <w:tcPr>
-            <w:tcW w:w="4819" w:type="dxa"/>
-            <w:tcBorders>
-              <w:top w:val="single" w:sz="4" w:space="0" w:color="000000"/>
-              <w:left w:val="single" w:sz="4" w:space="0" w:color="000000"/>
-              <w:bottom w:val="single" w:sz="4" w:space="0" w:color="000000"/>
-              <w:right w:val="single" w:sz="4" w:space="0" w:color="000000"/>
-            </w:tcBorders>
-          </w:tcPr>
-          <w:p>
-            <w:pPr>
-              <w:pStyle w:val="Normal"/>
-              <w:widowControl w:val="false"/>
-              <w:bidi w:val="0"/>
-              <w:jc w:val="center"/>
-              <w:rPr/>
-            </w:pPr>
-            <w:r>
-              <w:rPr/>
-              <w:t>asdasd</w:t>
-            </w:r>
-          </w:p>
-        </w:tc>
-      </w:tr>
-      <w:tr>
-        <w:trPr>
-          <w:trHeight w:val="450" w:hRule="atLeast"/>
-        </w:trPr>
-        <w:tc>
-          <w:tcPr>
-            <w:tcW w:w="4818" w:type="dxa"/>
-            <w:tcBorders>
-              <w:top w:val="single" w:sz="4" w:space="0" w:color="000000"/>
-              <w:left w:val="single" w:sz="4" w:space="0" w:color="000000"/>
-              <w:bottom w:val="single" w:sz="4" w:space="0" w:color="000000"/>
-            </w:tcBorders>
-          </w:tcPr>
-          <w:p>
-            <w:pPr>
-              <w:pStyle w:val="Normal"/>
-              <w:widowControl w:val="false"/>
-              <w:bidi w:val="0"/>
-              <w:jc w:val="left"/>
-              <w:rPr>
-                <w:b/>
-                <w:b/>
-                <w:bCs/>
-              </w:rPr>
-            </w:pPr>
-            <w:r>
-              <w:rPr>
-                <w:b/>
-                <w:bCs/>
-              </w:rPr>
-              <w:t>2000</w:t>
-            </w:r>
-          </w:p>
-        </w:tc>
-        <w:tc>
-          <w:tcPr>
-            <w:tcW w:w="4819" w:type="dxa"/>
-            <w:tcBorders>
-              <w:top w:val="single" w:sz="4" w:space="0" w:color="000000"/>
-              <w:left w:val="single" w:sz="4" w:space="0" w:color="000000"/>
-              <w:bottom w:val="single" w:sz="4" w:space="0" w:color="000000"/>
-              <w:right w:val="single" w:sz="4" w:space="0" w:color="000000"/>
-            </w:tcBorders>
-          </w:tcPr>
-          <w:p>
-            <w:pPr>
-              <w:pStyle w:val="Normal"/>
-              <w:widowControl w:val="false"/>
-              <w:bidi w:val="0"/>
-              <w:jc w:val="center"/>
-              <w:rPr/>
-            </w:pPr>
-            <w:r>
-              <w:rPr/>
-              <w:t>qwe</w:t>
-            </w:r>
-          </w:p>
-        </w:tc>
-      </w:tr>
-    </w:tbl>
-    <w:p>
-      <w:pPr>
-        <w:pStyle w:val="Normal"/>
-        <w:bidi w:val="0"/>
-        <w:jc w:val="center"/>
-        <w:rPr/>
-      </w:pPr>
-      <w:r>
-        <w:rPr/>
-      </w:r>
-      <w:r>
-        <w:br w:type="page"/>
-      </w:r>
-    </w:p>
-    <w:p>
-      <w:pPr>
-        <w:pStyle w:val="Normal"/>
-        <w:bidi w:val="0"/>
-        <w:jc w:val="center"/>
-        <w:rPr/>
-      </w:pPr>
-      <w:r>
-        <w:rPr/>
-        <w:t>table1</w:t>
-      </w:r>
-    </w:p>
-    <w:tbl>
-      <w:tblPr>
-        <w:tblW w:w="5000" w:type="pct"/>
-        <w:jc w:val="left"/>
-        <w:tblInd w:w="-5" w:type="dxa"/>
-        <w:tblLayout w:type="fixed"/>
-        <w:tblCellMar>
-          <w:top w:w="55" w:type="dxa"/>
-          <w:left w:w="55" w:type="dxa"/>
-          <w:bottom w:w="55" w:type="dxa"/>
-          <w:right w:w="55" w:type="dxa"/>
-        </w:tblCellMar>
-      </w:tblPr>
-      <w:tblGrid>
-        <w:gridCol w:w="4818"/>
-        <w:gridCol w:w="4819"/>
-      </w:tblGrid>
-      <w:tr>
-        <w:trPr>
-          <w:trHeight w:val="450" w:hRule="atLeast"/>
-        </w:trPr>
-        <w:tc>
-          <w:tcPr>
-            <w:tcW w:w="4818" w:type="dxa"/>
-            <w:tcBorders>
-              <w:top w:val="single" w:sz="4" w:space="0" w:color="000000"/>
-              <w:left w:val="single" w:sz="4" w:space="0" w:color="000000"/>
-              <w:bottom w:val="single" w:sz="4" w:space="0" w:color="000000"/>
-            </w:tcBorders>
-          </w:tcPr>
-          <w:p>
-            <w:pPr>
-              <w:pStyle w:val="Normal"/>
-              <w:widowControl w:val="false"/>
-              <w:bidi w:val="0"/>
-              <w:jc w:val="left"/>
-              <w:rPr>
-                <w:b/>
-                <w:b/>
-                <w:bCs/>
-              </w:rPr>
-            </w:pPr>
-            <w:r>
-              <w:rPr>
-                <w:b/>
-                <w:bCs/>
-              </w:rPr>
-              <w:t>1000.01</w:t>
-            </w:r>
-          </w:p>
-        </w:tc>
-        <w:tc>
-          <w:tcPr>
-            <w:tcW w:w="4819" w:type="dxa"/>
-            <w:tcBorders>
-              <w:top w:val="single" w:sz="4" w:space="0" w:color="000000"/>
-              <w:left w:val="single" w:sz="4" w:space="0" w:color="000000"/>
-              <w:bottom w:val="single" w:sz="4" w:space="0" w:color="000000"/>
-              <w:right w:val="single" w:sz="4" w:space="0" w:color="000000"/>
-            </w:tcBorders>
-          </w:tcPr>
-          <w:p>
-            <w:pPr>
-              <w:pStyle w:val="Normal"/>
-              <w:widowControl w:val="false"/>
-              <w:bidi w:val="0"/>
-              <w:jc w:val="center"/>
-              <w:rPr/>
-            </w:pPr>
-            <w:r>
-              <w:rPr/>
-              <w:t>asdasd</w:t>
-            </w:r>
-          </w:p>
-        </w:tc>
-      </w:tr>
-      <w:tr>
-        <w:trPr>
-          <w:trHeight w:val="450" w:hRule="atLeast"/>
-        </w:trPr>
-        <w:tc>
-          <w:tcPr>
-            <w:tcW w:w="4818" w:type="dxa"/>
-            <w:tcBorders>
-              <w:top w:val="single" w:sz="4" w:space="0" w:color="000000"/>
-              <w:left w:val="single" w:sz="4" w:space="0" w:color="000000"/>
-              <w:bottom w:val="single" w:sz="4" w:space="0" w:color="000000"/>
-            </w:tcBorders>
-          </w:tcPr>
-          <w:p>
-            <w:pPr>
-              <w:pStyle w:val="Normal"/>
-              <w:widowControl w:val="false"/>
-              <w:bidi w:val="0"/>
-              <w:jc w:val="left"/>
-              <w:rPr>
-                <w:b/>
-                <w:b/>
-                <w:bCs/>
-              </w:rPr>
-            </w:pPr>
-            <w:r>
-              <w:rPr>
-                <w:b/>
-                <w:bCs/>
-              </w:rPr>
-              <w:t>2000</w:t>
-            </w:r>
-          </w:p>
-        </w:tc>
-        <w:tc>
-          <w:tcPr>
-            <w:tcW w:w="4819" w:type="dxa"/>
-            <w:tcBorders>
-              <w:top w:val="single" w:sz="4" w:space="0" w:color="000000"/>
-              <w:left w:val="single" w:sz="4" w:space="0" w:color="000000"/>
-              <w:bottom w:val="single" w:sz="4" w:space="0" w:color="000000"/>
-              <w:right w:val="single" w:sz="4" w:space="0" w:color="000000"/>
-            </w:tcBorders>
-          </w:tcPr>
-          <w:p>
-            <w:pPr>
-              <w:pStyle w:val="Normal"/>
-              <w:widowControl w:val="false"/>
-              <w:bidi w:val="0"/>
-              <w:jc w:val="center"/>
-              <w:rPr/>
-            </w:pPr>
-            <w:r>
-              <w:rPr/>
-              <w:t>qwe</w:t>
-            </w:r>
-          </w:p>
-        </w:tc>
-      </w:tr>
-    </w:tbl>
-    <w:p>
-      <w:pPr>
-        <w:pStyle w:val="Normal"/>
-        <w:bidi w:val="0"/>
-        <w:jc w:val="center"/>
-        <w:rPr/>
-      </w:pPr>
-      <w:r>
-        <w:rPr/>
-      </w:r>
-      <w:r>
-        <w:br w:type="page"/>
-      </w:r>
-    </w:p>
-    <w:p>
-      <w:pPr>
-        <w:pStyle w:val="Normal"/>
-        <w:bidi w:val="0"/>
-        <w:jc w:val="center"/>
-        <w:rPr/>
-      </w:pPr>
-      <w:r>
-        <w:rPr/>
-        <w:t>table1</w:t>
-      </w:r>
-    </w:p>
-    <w:tbl>
-      <w:tblPr>
-        <w:tblW w:w="5000" w:type="pct"/>
-        <w:jc w:val="left"/>
-        <w:tblInd w:w="-5" w:type="dxa"/>
-        <w:tblLayout w:type="fixed"/>
-        <w:tblCellMar>
-          <w:top w:w="55" w:type="dxa"/>
-          <w:left w:w="55" w:type="dxa"/>
-          <w:bottom w:w="55" w:type="dxa"/>
-          <w:right w:w="55" w:type="dxa"/>
-        </w:tblCellMar>
-      </w:tblPr>
-      <w:tblGrid>
-        <w:gridCol w:w="4818"/>
-        <w:gridCol w:w="4819"/>
-      </w:tblGrid>
-      <w:tr>
-        <w:trPr>
-          <w:trHeight w:val="450" w:hRule="atLeast"/>
-        </w:trPr>
-        <w:tc>
-          <w:tcPr>
-            <w:tcW w:w="4818" w:type="dxa"/>
-            <w:tcBorders>
-              <w:top w:val="single" w:sz="4" w:space="0" w:color="000000"/>
-              <w:left w:val="single" w:sz="4" w:space="0" w:color="000000"/>
-              <w:bottom w:val="single" w:sz="4" w:space="0" w:color="000000"/>
-            </w:tcBorders>
-          </w:tcPr>
-          <w:p>
-            <w:pPr>
-              <w:pStyle w:val="Normal"/>
-              <w:widowControl w:val="false"/>
-              <w:bidi w:val="0"/>
-              <w:jc w:val="left"/>
-              <w:rPr>
-                <w:b/>
-                <w:b/>
-                <w:bCs/>
-              </w:rPr>
-            </w:pPr>
-            <w:r>
-              <w:rPr>
-                <w:b/>
-                <w:bCs/>
-              </w:rPr>
-              <w:t>1000.01</w:t>
-            </w:r>
-          </w:p>
-        </w:tc>
-        <w:tc>
-          <w:tcPr>
-            <w:tcW w:w="4819" w:type="dxa"/>
-            <w:tcBorders>
-              <w:top w:val="single" w:sz="4" w:space="0" w:color="000000"/>
-              <w:left w:val="single" w:sz="4" w:space="0" w:color="000000"/>
-              <w:bottom w:val="single" w:sz="4" w:space="0" w:color="000000"/>
-              <w:right w:val="single" w:sz="4" w:space="0" w:color="000000"/>
-            </w:tcBorders>
-          </w:tcPr>
-          <w:p>
-            <w:pPr>
-              <w:pStyle w:val="Normal"/>
-              <w:widowControl w:val="false"/>
-              <w:bidi w:val="0"/>
-              <w:jc w:val="center"/>
-              <w:rPr/>
-            </w:pPr>
-            <w:r>
-              <w:rPr/>
-              <w:t>asdasd</w:t>
-            </w:r>
-          </w:p>
-        </w:tc>
-      </w:tr>
-      <w:tr>
-        <w:trPr>
-          <w:trHeight w:val="450" w:hRule="atLeast"/>
-        </w:trPr>
-        <w:tc>
-          <w:tcPr>
-            <w:tcW w:w="4818" w:type="dxa"/>
-            <w:tcBorders>
-              <w:top w:val="single" w:sz="4" w:space="0" w:color="000000"/>
-              <w:left w:val="single" w:sz="4" w:space="0" w:color="000000"/>
-              <w:bottom w:val="single" w:sz="4" w:space="0" w:color="000000"/>
-            </w:tcBorders>
-          </w:tcPr>
-          <w:p>
-            <w:pPr>
-              <w:pStyle w:val="Normal"/>
-              <w:widowControl w:val="false"/>
-              <w:bidi w:val="0"/>
-              <w:jc w:val="left"/>
-              <w:rPr>
-                <w:b/>
-                <w:b/>
-                <w:bCs/>
-              </w:rPr>
-            </w:pPr>
-            <w:r>
-              <w:rPr>
-                <w:b/>
-                <w:bCs/>
-              </w:rPr>
-              <w:t>2000</w:t>
-            </w:r>
-          </w:p>
-        </w:tc>
-        <w:tc>
-          <w:tcPr>
-            <w:tcW w:w="4819" w:type="dxa"/>
-            <w:tcBorders>
-              <w:top w:val="single" w:sz="4" w:space="0" w:color="000000"/>
-              <w:left w:val="single" w:sz="4" w:space="0" w:color="000000"/>
-              <w:bottom w:val="single" w:sz="4" w:space="0" w:color="000000"/>
-              <w:right w:val="single" w:sz="4" w:space="0" w:color="000000"/>
-            </w:tcBorders>
-          </w:tcPr>
-          <w:p>
-            <w:pPr>
-              <w:pStyle w:val="Normal"/>
-              <w:widowControl w:val="false"/>
-              <w:bidi w:val="0"/>
-              <w:jc w:val="center"/>
-              <w:rPr/>
-            </w:pPr>
-            <w:r>
-              <w:rPr/>
-              <w:t>qwe</w:t>
-            </w:r>
-          </w:p>
-        </w:tc>
-      </w:tr>
-    </w:tbl>
-    <w:p>
-      <w:pPr>
-        <w:pStyle w:val="Normal"/>
-        <w:bidi w:val="0"/>
-        <w:jc w:val="center"/>
-        <w:rPr/>
-      </w:pPr>
-      <w:r>
-        <w:rPr/>
-      </w:r>
-    </w:p>
-    <w:p>
-      <w:pPr>
-        <w:pStyle w:val="Normal"/>
-        <w:bidi w:val="0"/>
-        <w:jc w:val="center"/>
-        <w:rPr/>
-      </w:pPr>
-      <w:r>
-        <w:rPr/>
-        <w:t>table1</w:t>
-      </w:r>
-    </w:p>
-    <w:tbl>
-      <w:tblPr>
-        <w:tblW w:w="5000" w:type="pct"/>
-        <w:jc w:val="left"/>
-        <w:tblInd w:w="-5" w:type="dxa"/>
-        <w:tblLayout w:type="fixed"/>
-        <w:tblCellMar>
-          <w:top w:w="55" w:type="dxa"/>
-          <w:left w:w="55" w:type="dxa"/>
-          <w:bottom w:w="55" w:type="dxa"/>
-          <w:right w:w="55" w:type="dxa"/>
-        </w:tblCellMar>
-      </w:tblPr>
-      <w:tblGrid>
-        <w:gridCol w:w="4818"/>
-        <w:gridCol w:w="4819"/>
-      </w:tblGrid>
-      <w:tr>
-        <w:trPr>
-          <w:trHeight w:val="450" w:hRule="atLeast"/>
-        </w:trPr>
-        <w:tc>
-          <w:tcPr>
-            <w:tcW w:w="4818" w:type="dxa"/>
-            <w:tcBorders>
-              <w:top w:val="single" w:sz="4" w:space="0" w:color="000000"/>
-              <w:left w:val="single" w:sz="4" w:space="0" w:color="000000"/>
-              <w:bottom w:val="single" w:sz="4" w:space="0" w:color="000000"/>
-            </w:tcBorders>
-          </w:tcPr>
-          <w:p>
-            <w:pPr>
-              <w:pStyle w:val="Normal"/>
-              <w:widowControl w:val="false"/>
-              <w:bidi w:val="0"/>
-              <w:jc w:val="left"/>
-              <w:rPr>
-                <w:b/>
-                <w:b/>
-                <w:bCs/>
-              </w:rPr>
-            </w:pPr>
-            <w:r>
-              <w:rPr>
-                <w:b/>
-                <w:bCs/>
-              </w:rPr>
-              <w:t>1000.01</w:t>
-            </w:r>
-          </w:p>
-        </w:tc>
-        <w:tc>
-          <w:tcPr>
-            <w:tcW w:w="4819" w:type="dxa"/>
-            <w:tcBorders>
-              <w:top w:val="single" w:sz="4" w:space="0" w:color="000000"/>
-              <w:left w:val="single" w:sz="4" w:space="0" w:color="000000"/>
-              <w:bottom w:val="single" w:sz="4" w:space="0" w:color="000000"/>
-              <w:right w:val="single" w:sz="4" w:space="0" w:color="000000"/>
-            </w:tcBorders>
-          </w:tcPr>
-          <w:p>
-            <w:pPr>
-              <w:pStyle w:val="Normal"/>
-              <w:widowControl w:val="false"/>
-              <w:bidi w:val="0"/>
-              <w:jc w:val="center"/>
-              <w:rPr/>
-            </w:pPr>
-            <w:r>
-              <w:rPr/>
-              <w:t>asdasd</w:t>
-            </w:r>
-          </w:p>
-        </w:tc>
-      </w:tr>
-      <w:tr>
-        <w:trPr>
-          <w:trHeight w:val="450" w:hRule="atLeast"/>
-        </w:trPr>
-        <w:tc>
-          <w:tcPr>
-            <w:tcW w:w="4818" w:type="dxa"/>
-            <w:tcBorders>
-              <w:top w:val="single" w:sz="4" w:space="0" w:color="000000"/>
-              <w:left w:val="single" w:sz="4" w:space="0" w:color="000000"/>
-              <w:bottom w:val="single" w:sz="4" w:space="0" w:color="000000"/>
-            </w:tcBorders>
-          </w:tcPr>
-          <w:p>
-            <w:pPr>
-              <w:pStyle w:val="Normal"/>
-              <w:widowControl w:val="false"/>
-              <w:bidi w:val="0"/>
-              <w:jc w:val="left"/>
-              <w:rPr>
-                <w:b/>
-                <w:b/>
-                <w:bCs/>
-              </w:rPr>
-            </w:pPr>
-            <w:r>
-              <w:rPr>
-                <w:b/>
-                <w:bCs/>
-              </w:rPr>
-              <w:t>2000</w:t>
-            </w:r>
-          </w:p>
-        </w:tc>
-        <w:tc>
-          <w:tcPr>
-            <w:tcW w:w="4819" w:type="dxa"/>
-            <w:tcBorders>
-              <w:top w:val="single" w:sz="4" w:space="0" w:color="000000"/>
-              <w:left w:val="single" w:sz="4" w:space="0" w:color="000000"/>
-              <w:bottom w:val="single" w:sz="4" w:space="0" w:color="000000"/>
-              <w:right w:val="single" w:sz="4" w:space="0" w:color="000000"/>
-            </w:tcBorders>
-          </w:tcPr>
-          <w:p>
-            <w:pPr>
-              <w:pStyle w:val="Normal"/>
-              <w:widowControl w:val="false"/>
-              <w:bidi w:val="0"/>
-              <w:jc w:val="center"/>
-              <w:rPr/>
-            </w:pPr>
-            <w:r>
-              <w:rPr/>
-              <w:t>qwe</w:t>
-            </w:r>
-          </w:p>
-        </w:tc>
-      </w:tr>
-    </w:tbl>
-    <w:p>
-      <w:pPr>
-        <w:pStyle w:val="Normal"/>
-        <w:bidi w:val="0"/>
-        <w:jc w:val="center"/>
-        <w:rPr/>
-      </w:pPr>
-      <w:r>
-        <w:rPr/>
-      </w:r>
     </w:p>
     <w:p>
       <w:pPr>
@@ -1859,7 +1075,7 @@
             </w:pPr>
             <w:r>
               <w:rPr/>
-              <w:t>100.00</w:t>
+              <w:t>100</w:t>
             </w:r>
           </w:p>
         </w:tc>
@@ -2118,7 +1334,7 @@
       </w:pPr>
       <w:r>
         <w:rPr/>
-        <w:t xml:space="preserve">Items: {description: Service 1, price: 100.00, quantity: 2}, {description: Service 2, price: 200, quantity: 2}, {description: Service 3, price: 300, quantity: 2}, {description: Service 4, price: 400, quantity: 2} </w:t>
+        <w:t xml:space="preserve">Items: {description: Service 1, price: 100, quantity: 2}, {description: Service 2, price: 200, quantity: 2}, {description: Service 3, price: 300, quantity: 2}, {description: Service 4, price: 400, quantity: 2} </w:t>
       </w:r>
     </w:p>
     <w:p>
@@ -2211,7 +1427,7 @@
       </w:pPr>
       <w:r>
         <w:rPr/>
-        <w:t>First Item price: 100.00</w:t>
+        <w:t>First Item price: 100</w:t>
       </w:r>
     </w:p>
     <w:p>
@@ -2303,7 +1519,7 @@
       </w:pPr>
       <w:r>
         <w:rPr/>
-        <w:t xml:space="preserve">Items (Objects): {description: Service 1, price: 100.00, quantity: 2}, {description: Service 2, price: 200, quantity: 2}, {description: Service 3, price: 300, quantity: 2}, {description: Service 4, price: 400, quantity: 2} </w:t>
+        <w:t xml:space="preserve">Items (Objects): {description: Service 1, price: 100, quantity: 2}, {description: Service 2, price: 200, quantity: 2}, {description: Service 3, price: 300, quantity: 2}, {description: Service 4, price: 400, quantity: 2} </w:t>
       </w:r>
     </w:p>
     <w:p>
@@ -2339,7 +1555,7 @@
       </w:pPr>
       <w:r>
         <w:rPr/>
-        <w:t xml:space="preserve">Prices: 100.00, 200, 300, 400 </w:t>
+        <w:t xml:space="preserve">Prices: 100, 200, 300, 400 </w:t>
       </w:r>
     </w:p>
     <w:p>
@@ -2413,7 +1629,7 @@
       </w:pPr>
       <w:r>
         <w:rPr/>
-        <w:t xml:space="preserve">Items (Objects): {description: Service 1, price: 100.00, quantity: 2}, {description: Service 2, price: 200, quantity: 2}, {description: Service 3, price: 300, quantity: 2}, {description: Service 4, price: 400, quantity: 2} </w:t>
+        <w:t xml:space="preserve">Items (Objects): {description: Service 1, price: 100, quantity: 2}, {description: Service 2, price: 200, quantity: 2}, {description: Service 3, price: 300, quantity: 2}, {description: Service 4, price: 400, quantity: 2} </w:t>
       </w:r>
     </w:p>
     <w:p>
@@ -2449,7 +1665,7 @@
       </w:pPr>
       <w:r>
         <w:rPr/>
-        <w:t xml:space="preserve">Prices: 100.00, 200, 300, 400 </w:t>
+        <w:t xml:space="preserve">Prices: 100, 200, 300, 400 </w:t>
       </w:r>
     </w:p>
     <w:p>
@@ -2493,9 +1709,10 @@
       </w:r>
     </w:p>
     <w:sectPr>
+      <w:headerReference w:type="default" r:id="rId2"/>
       <w:type w:val="nextPage"/>
       <w:pgSz w:w="11906" w:h="16838"/>
-      <w:pgMar w:left="1134" w:right="1134" w:gutter="0" w:header="0" w:top="1134" w:footer="0" w:bottom="1134"/>
+      <w:pgMar w:left="1134" w:right="1134" w:gutter="0" w:header="1134" w:top="1693" w:footer="0" w:bottom="1134"/>
       <w:pgNumType w:fmt="decimal"/>
       <w:formProt w:val="false"/>
       <w:textDirection w:val="lrTb"/>
@@ -2503,6 +1720,21 @@
     </w:sectPr>
   </w:body>
 </w:document>
+</file>
+
+<file path=word/header1.xml><?xml version="1.0" encoding="utf-8"?>
+<w:hdr xmlns:o="urn:schemas-microsoft-com:office:office" xmlns:r="http://schemas.openxmlformats.org/officeDocument/2006/relationships" xmlns:v="urn:schemas-microsoft-com:vml" xmlns:w="http://schemas.openxmlformats.org/wordprocessingml/2006/main" xmlns:w10="urn:schemas-microsoft-com:office:word" xmlns:wp="http://schemas.openxmlformats.org/drawingml/2006/wordprocessingDrawing" xmlns:wps="http://schemas.microsoft.com/office/word/2010/wordprocessingShape" xmlns:wpg="http://schemas.microsoft.com/office/word/2010/wordprocessingGroup" xmlns:mc="http://schemas.openxmlformats.org/markup-compatibility/2006" xmlns:wp14="http://schemas.microsoft.com/office/word/2010/wordprocessingDrawing" xmlns:w14="http://schemas.microsoft.com/office/word/2010/wordml" xmlns:w15="http://schemas.microsoft.com/office/word/2012/wordml" mc:Ignorable="w14 wp14 w15">
+  <w:p>
+    <w:pPr>
+      <w:pStyle w:val="Header"/>
+      <w:rPr/>
+    </w:pPr>
+    <w:r>
+      <w:rPr/>
+      <w:t>This is header</w:t>
+    </w:r>
+  </w:p>
+</w:hdr>
 </file>
 
 <file path=word/styles.xml><?xml version="1.0" encoding="utf-8"?>
@@ -2630,5 +1862,27 @@
       <w:szCs w:val="20"/>
     </w:rPr>
   </w:style>
+  <w:style w:type="paragraph" w:styleId="HeaderandFooter">
+    <w:name w:val="Header and Footer"/>
+    <w:basedOn w:val="Normal"/>
+    <w:qFormat/>
+    <w:pPr>
+      <w:suppressLineNumbers/>
+      <w:tabs>
+        <w:tab w:val="clear" w:pos="709"/>
+        <w:tab w:val="center" w:pos="4819" w:leader="none"/>
+        <w:tab w:val="right" w:pos="9638" w:leader="none"/>
+      </w:tabs>
+    </w:pPr>
+    <w:rPr/>
+  </w:style>
+  <w:style w:type="paragraph" w:styleId="Header">
+    <w:name w:val="Header"/>
+    <w:basedOn w:val="HeaderandFooter"/>
+    <w:pPr>
+      <w:suppressLineNumbers/>
+    </w:pPr>
+    <w:rPr/>
+  </w:style>
 </w:styles>
 </file>
</xml_diff>